<commit_message>
docs(distribution): rework plan v3 for low-budget creative/social/AI focus
Reworked per updated brief (small budget; focus on creativity + social
+ AI content) — shifts emphasis from paid channels to organic and craft:
- New core lever (sec.6): Hireon's own agents run Hireon's marketing
  (dogfooding) = content + live demo + proof in one action
- Creative formats: build-in-public, short 'AI solved it in 3s' videos,
  public teardowns of real businesses, lead magnets, AI-made visuals
  (Kandinsky/Shedevrum free in RU)
- Social = RU-legal only (Telegram/VK/Dzen/YouTube/Rutube); paid demoted
  to micro-tests (Telegram seeding 5-15k RUB) after organic validation
- NPD/IP fork softened (not urgent on small budget); legal frame kept
Pointer in todo.md updated to v3.

Co-Authored-By: Claude Opus 4.8 <noreply@anthropic.com>
</commit_message>
<xml_diff>
--- a/drafts/hireon-distribution-plan.docx
+++ b/drafts/hireon-distribution-plan.docx
@@ -41,7 +41,7 @@
           <w:color w:val="6B7277"/>
           <w:sz w:val="20"/>
         </w:rPr>
-        <w:t>Phase 0 (pre-launch) · июнь 2026 · внутренний рабочий документ · вводная: «готовы к раскрутке любыми способами»</w:t>
+        <w:t>Phase 0 · июнь 2026 · рабочий документ · режим: небольшой бюджет, фокус — творчество + соцсети + AI-контент</w:t>
       </w:r>
     </w:p>
     <w:p/>
@@ -61,7 +61,7 @@
           <w:color w:val="3A444B"/>
           <w:sz w:val="21"/>
         </w:rPr>
-        <w:t>Продукт готов и работает. Узкое место — не код, а дистрибуция с нуля. «Любыми способами» здесь значит «любыми легальными и окупаемыми», а не «жечь бюджет вслепую»: три РФ-закона 2025 года и режим НПД жёстко определяют, какие каналы вообще доступны и где потолок. Сначала эта рамка, потом тактика.</w:t>
+        <w:t>Денег мало, поэтому главный ресурс — не бюджет, а время, креатив и сам продукт. Ключевой рычаг: Hireon продаёт контент-агентов, значит маркетинг Hireon ведут эти же агенты — это одновременно контент, демо и доказательство. Платная реклама — точечно и только после того, как органика докажет конверсию.</w:t>
       </w:r>
     </w:p>
     <w:p>
@@ -80,7 +80,7 @@
           <w:color w:val="0F766E"/>
           <w:sz w:val="30"/>
         </w:rPr>
-        <w:t>0. Главные выводы (то, чего не было в старом плане)</w:t>
+        <w:t>0. Главные выводы (режим малого бюджета)</w:t>
       </w:r>
     </w:p>
     <w:p>
@@ -97,7 +97,7 @@
           <w:color w:val="1A1A1A"/>
           <w:sz w:val="21"/>
         </w:rPr>
-        <w:t xml:space="preserve">Старый план писался в логике «соло без денег и как построить MVP». </w:t>
+        <w:t xml:space="preserve">Рычаг №1 — dogfooding: </w:t>
       </w:r>
       <w:r>
         <w:rPr>
@@ -107,7 +107,7 @@
           <w:color w:val="1A1A1A"/>
           <w:sz w:val="21"/>
         </w:rPr>
-        <w:t>Продукт уже построен, а вы готовы вкладываться — поэтому платные каналы выходят вперёд параллельно с валидацией, а не «когда-нибудь потом».</w:t>
+        <w:t>канал и соцсети Hireon ведёт собственный агент-копирайтер, ответы на отзывы пишет агент-2ГИС и т.д. Контент почти бесплатен, и каждый пост = живое демо продукта. Ни одна директория-конкурент так не может.</w:t>
       </w:r>
     </w:p>
     <w:p>
@@ -124,7 +124,7 @@
           <w:color w:val="1A1A1A"/>
           <w:sz w:val="21"/>
         </w:rPr>
-        <w:t xml:space="preserve">Юридика РФ-2026 вычёркивает половину старых каналов. </w:t>
+        <w:t xml:space="preserve">Творчество вместо бюджета: </w:t>
       </w:r>
       <w:r>
         <w:rPr>
@@ -134,7 +134,7 @@
           <w:color w:val="1A1A1A"/>
           <w:sz w:val="21"/>
         </w:rPr>
-        <w:t>Реклама в Instagram, Facebook, X (Twitter), LinkedIn, Discord, Reddit, Viber запрещена с 01.09.2025 (ФЗ-72), штрафы. «Build in public в Twitter», «аутрич в Reddit», «Discord/Cabinet» из старого плана — для РФ-резидента теперь риск, а не канал.</w:t>
+        <w:t>building in public, короткие видео «AI решил задачу за 3 секунды», публичные разборы реального бизнеса, лид-магниты («100 готовых ответов на отзывы»). Вирусность и польза, а не платные показы.</w:t>
       </w:r>
     </w:p>
     <w:p>
@@ -151,7 +151,7 @@
           <w:color w:val="1A1A1A"/>
           <w:sz w:val="21"/>
         </w:rPr>
-        <w:t xml:space="preserve">Деньги в Phase 0 — только со своих агентов. </w:t>
+        <w:t xml:space="preserve">Соцсети — только легальные РФ: </w:t>
       </w:r>
       <w:r>
         <w:rPr>
@@ -161,34 +161,7 @@
           <w:color w:val="1A1A1A"/>
           <w:sz w:val="21"/>
         </w:rPr>
-        <w:t>НПД + 422-ФЗ запрещают принимать платежи за чужие услуги. Раскручивать «маркетплейс как маркетплейс» сейчас монетизационно бессмысленно — раскручиваем 8 своих продуктов.</w:t>
-      </w:r>
-    </w:p>
-    <w:p>
-      <w:pPr>
-        <w:pStyle w:val="ListBullet"/>
-        <w:spacing w:after="60"/>
-        <w:ind w:left="340"/>
-      </w:pPr>
-      <w:r>
-        <w:rPr>
-          <w:rFonts w:ascii="Calibri" w:hAnsi="Calibri"/>
-          <w:b/>
-          <w:i w:val="0"/>
-          <w:color w:val="9B2C2C"/>
-          <w:sz w:val="21"/>
-        </w:rPr>
-        <w:t xml:space="preserve">Развилка, которую надо решить ДО заливки бюджета: </w:t>
-      </w:r>
-      <w:r>
-        <w:rPr>
-          <w:rFonts w:ascii="Calibri" w:hAnsi="Calibri"/>
-          <w:b w:val="0"/>
-          <w:i w:val="0"/>
-          <w:color w:val="1A1A1A"/>
-          <w:sz w:val="21"/>
-        </w:rPr>
-        <w:t>режим НПД даёт потолок ~200к ₽/мес и запрещает полноценный маркетплейс. Если реклама сработает — упрётесь в потолок за 2-3 месяца. «Любыми способами» = в т.ч. готовность открыть ИП/ООО заранее.</w:t>
+        <w:t>Telegram, VK (+ Клипы), Дзен, YouTube/VK Видео/Rutube. Instagram, X, Reddit, Discord, LinkedIn — реклама ЗАПРЕЩЕНА (ФЗ-72, штрафы). Туда не идём.</w:t>
       </w:r>
     </w:p>
     <w:p>
@@ -205,7 +178,7 @@
           <w:color w:val="1A1A1A"/>
           <w:sz w:val="21"/>
         </w:rPr>
-        <w:t xml:space="preserve">Барьер №1 — не каналы, а доверие. </w:t>
+        <w:t xml:space="preserve">AI удешевляет производство: </w:t>
       </w:r>
       <w:r>
         <w:rPr>
@@ -215,7 +188,7 @@
           <w:color w:val="1A1A1A"/>
           <w:sz w:val="21"/>
         </w:rPr>
-        <w:t>МСБ боится, что AI опозорит его перед клиентами (бот, ответы на отзывы — публичны), а кейсов пока ноль. Без гарантий, пилотов и соцдоказательства любой трафик сольётся.</w:t>
+        <w:t>тексты — свои агенты + Claude/GPT; визуал — Kandinsky/Шедеврум (бесплатно, РФ) и Midjourney; видео — AI-раскадровки и синтез речи. Соло-founder работает как контент-студия.</w:t>
       </w:r>
     </w:p>
     <w:p>
@@ -232,7 +205,7 @@
           <w:color w:val="1A1A1A"/>
           <w:sz w:val="21"/>
         </w:rPr>
-        <w:t xml:space="preserve">Дисциплина денег: </w:t>
+        <w:t xml:space="preserve">Платное — микро-тесты, не основа: </w:t>
       </w:r>
       <w:r>
         <w:rPr>
@@ -242,7 +215,34 @@
           <w:color w:val="1A1A1A"/>
           <w:sz w:val="21"/>
         </w:rPr>
-        <w:t>сначала довести 1 агента до доказанной экономики (CAC/LTV) органикой и прямыми продажами, потом лить платный бюджет в то, что уже конвертит. Не наоборот.</w:t>
+        <w:t>5-15к ₽ на Telegram-посев в нишевом канале или Дзен-промо, и только на агента, который УЖЕ конвертит в органике. Сначала доказать, потом платить.</w:t>
+      </w:r>
+    </w:p>
+    <w:p>
+      <w:pPr>
+        <w:pStyle w:val="ListBullet"/>
+        <w:spacing w:after="60"/>
+        <w:ind w:left="340"/>
+      </w:pPr>
+      <w:r>
+        <w:rPr>
+          <w:rFonts w:ascii="Calibri" w:hAnsi="Calibri"/>
+          <w:b/>
+          <w:i w:val="0"/>
+          <w:color w:val="1A1A1A"/>
+          <w:sz w:val="21"/>
+        </w:rPr>
+        <w:t xml:space="preserve">Барьер №1 всё ещё доверие: </w:t>
+      </w:r>
+      <w:r>
+        <w:rPr>
+          <w:rFonts w:ascii="Calibri" w:hAnsi="Calibri"/>
+          <w:b w:val="0"/>
+          <w:i w:val="0"/>
+          <w:color w:val="1A1A1A"/>
+          <w:sz w:val="21"/>
+        </w:rPr>
+        <w:t>контент и кейсы его и снимают — показываем агента в деле на реальных задачах, с цифрами и гарантией возврата.</w:t>
       </w:r>
     </w:p>
     <w:p>
@@ -261,100 +261,7 @@
           <w:color w:val="0F766E"/>
           <w:sz w:val="30"/>
         </w:rPr>
-        <w:t>1. Отправная точка и правовая рамка РФ-2026</w:t>
-      </w:r>
-    </w:p>
-    <w:p>
-      <w:pPr>
-        <w:keepNext/>
-        <w:spacing w:before="200" w:after="60"/>
-      </w:pPr>
-      <w:r>
-        <w:rPr>
-          <w:rFonts w:ascii="Calibri" w:hAnsi="Calibri"/>
-          <w:b/>
-          <w:i w:val="0"/>
-          <w:color w:val="3A444B"/>
-          <w:sz w:val="23"/>
-        </w:rPr>
-        <w:t>Что есть / чего нет</w:t>
-      </w:r>
-    </w:p>
-    <w:p>
-      <w:pPr>
-        <w:pStyle w:val="ListBullet"/>
-        <w:spacing w:after="60"/>
-        <w:ind w:left="340"/>
-      </w:pPr>
-      <w:r>
-        <w:rPr>
-          <w:rFonts w:ascii="Calibri" w:hAnsi="Calibri"/>
-          <w:b w:val="0"/>
-          <w:i w:val="0"/>
-          <w:color w:val="1A1A1A"/>
-          <w:sz w:val="21"/>
-        </w:rPr>
-        <w:t>Есть: рабочий прод hireon.agency, 8 агентов (990-6200 ₽/мес), ЮКасса + NowPayments, отполированный лендинг, пройденный security review, готовые launch-посты.</w:t>
-      </w:r>
-    </w:p>
-    <w:p>
-      <w:pPr>
-        <w:pStyle w:val="ListBullet"/>
-        <w:spacing w:after="60"/>
-        <w:ind w:left="340"/>
-      </w:pPr>
-      <w:r>
-        <w:rPr>
-          <w:rFonts w:ascii="Calibri" w:hAnsi="Calibri"/>
-          <w:b/>
-          <w:i w:val="0"/>
-          <w:color w:val="9B2C2C"/>
-          <w:sz w:val="21"/>
-        </w:rPr>
-        <w:t xml:space="preserve">Чего нет (риск №1): </w:t>
-      </w:r>
-      <w:r>
-        <w:rPr>
-          <w:rFonts w:ascii="Calibri" w:hAnsi="Calibri"/>
-          <w:b w:val="0"/>
-          <w:i w:val="0"/>
-          <w:color w:val="1A1A1A"/>
-          <w:sz w:val="21"/>
-        </w:rPr>
-        <w:t>ни одной завершённой платной подписки end-to-end. Весь путь оплаты (checkout → webhook → деплой контейнера → recurring) прогнать СВОЕЙ картой ДО любого трафика. Платный трафик в сломанную оплату = деньги в мусор.</w:t>
-      </w:r>
-    </w:p>
-    <w:p>
-      <w:pPr>
-        <w:pStyle w:val="ListBullet"/>
-        <w:spacing w:after="60"/>
-        <w:ind w:left="340"/>
-      </w:pPr>
-      <w:r>
-        <w:rPr>
-          <w:rFonts w:ascii="Calibri" w:hAnsi="Calibri"/>
-          <w:b w:val="0"/>
-          <w:i w:val="0"/>
-          <w:color w:val="1A1A1A"/>
-          <w:sz w:val="21"/>
-        </w:rPr>
-        <w:t>Нет органического трафика, узнаваемости, входящих лидов и публичных кейсов.</w:t>
-      </w:r>
-    </w:p>
-    <w:p>
-      <w:pPr>
-        <w:keepNext/>
-        <w:spacing w:before="200" w:after="60"/>
-      </w:pPr>
-      <w:r>
-        <w:rPr>
-          <w:rFonts w:ascii="Calibri" w:hAnsi="Calibri"/>
-          <w:b/>
-          <w:i w:val="0"/>
-          <w:color w:val="3A444B"/>
-          <w:sz w:val="23"/>
-        </w:rPr>
-        <w:t>Три закона, которые определяют список каналов (проверено, июнь 2026)</w:t>
+        <w:t>1. Правовая рамка РФ-2026 (не зависит от бюджета)</w:t>
       </w:r>
     </w:p>
     <w:p>
@@ -371,7 +278,7 @@
           <w:color w:val="1A1A1A"/>
           <w:sz w:val="21"/>
         </w:rPr>
-        <w:t xml:space="preserve">ФЗ-72 (с 01.09.2025) — запрет рекламы в «нежелательных» соцсетях: </w:t>
+        <w:t xml:space="preserve">ФЗ-72 (с 01.09.2025): </w:t>
       </w:r>
       <w:r>
         <w:rPr>
@@ -381,7 +288,7 @@
           <w:color w:val="1A1A1A"/>
           <w:sz w:val="21"/>
         </w:rPr>
-        <w:t>Instagram, Facebook, X/Twitter, LinkedIn, Discord, Reddit, Viber. Штраф самозанятому 2000-2500 ₽ за каждый пост/сторис, юрлицу до 500 000 ₽. Вести свой аккаунт и рассказывать о продукте — можно; платить за рекламу и партнёрские размещения — нельзя.</w:t>
+        <w:t>реклама запрещена в Instagram, Facebook, X/Twitter, LinkedIn, Discord, Reddit, Viber. Штраф самозанятому 2000-2500 ₽ за пост, юрлицу до 500к. Вести свой аккаунт и рассказывать о продукте — можно; платная реклама и партнёрские посты — нельзя. Вывод: эти площадки не используем для продвижения.</w:t>
       </w:r>
     </w:p>
     <w:p>
@@ -398,7 +305,7 @@
           <w:color w:val="1A1A1A"/>
           <w:sz w:val="21"/>
         </w:rPr>
-        <w:t xml:space="preserve">Маркировка ЕРИР/ОРД (с 2023) + рекламный сбор 3% (с 01.04.2025): </w:t>
+        <w:t xml:space="preserve">Маркировка ЕРИР + сбор 3% (с 2025): </w:t>
       </w:r>
       <w:r>
         <w:rPr>
@@ -408,7 +315,7 @@
           <w:color w:val="1A1A1A"/>
           <w:sz w:val="21"/>
         </w:rPr>
-        <w:t>любая платная интернет-реклама требует erid-токена, отчётности в Роскомнадзор и +3% от бюджета в бюджет РФ. Это касается и таргета, и посевов в Telegram. Закладывать в смету и процессы.</w:t>
+        <w:t>любая платная интернет-реклама требует erid-токена, отчёта в Роскомнадзор и +3% бюджета. Касается и посевов в Telegram. Органический контент (свой канал, статьи) — НЕ реклама, маркировки не требует.</w:t>
       </w:r>
     </w:p>
     <w:p>
@@ -425,7 +332,7 @@
           <w:color w:val="1A1A1A"/>
           <w:sz w:val="21"/>
         </w:rPr>
-        <w:t xml:space="preserve">НПД (самозанятость) + 422-ФЗ: </w:t>
+        <w:t xml:space="preserve">НПД + 422-ФЗ: </w:t>
       </w:r>
       <w:r>
         <w:rPr>
@@ -435,7 +342,7 @@
           <w:color w:val="1A1A1A"/>
           <w:sz w:val="21"/>
         </w:rPr>
-        <w:t>лимит 2.4 млн ₽/год (~200к ₽/мес), нельзя нанимать в штат, нельзя принимать платежи за чужие услуги. Подрядчиков по договору (ГПХ/самозанятые/ИП) привлекать можно — это не штат.</w:t>
+        <w:t>деньги только со своих агентов; сторонним — бесплатное размещение. Лимит 2.4 млн ₽/год.</w:t>
       </w:r>
     </w:p>
     <w:p>
@@ -454,7 +361,7 @@
           <w:color w:val="3A444B"/>
           <w:sz w:val="21"/>
         </w:rPr>
-        <w:t>Легальное рекламное поле РФ-2026, где и работаем: Яндекс (Директ, РСЯ), VK Реклама, Telegram (Ads через реселлеров + посевы в каналах), МТС Маркетолог, Авито, YouTube/VK Видео/Rutube, плюс органика: Telegram, VC.ru, Habr, SEO. Всё платное — через ЕРИР-маркировку.</w:t>
+        <w:t>Легальное поле, где работаем: органика (Telegram, VK, Дзен, YouTube/Rutube, VC.ru, Habr, SEO) + точечное платное (Telegram-посевы, Дзен-промо, VK Реклама, Яндекс.Директ) через ЕРИР-маркировку.</w:t>
       </w:r>
     </w:p>
     <w:p>
@@ -473,7 +380,7 @@
           <w:color w:val="0F766E"/>
           <w:sz w:val="30"/>
         </w:rPr>
-        <w:t>2. Стратегическая развилка: НПД-потолок против раннего ИП</w:t>
+        <w:t>2. Развилка НПД / ИП (при малом бюджете — не срочно, но держать в уме)</w:t>
       </w:r>
     </w:p>
     <w:p>
@@ -485,7 +392,53 @@
           <w:color w:val="1A1A1A"/>
           <w:sz w:val="21"/>
         </w:rPr>
-        <w:t>Это первое бизнес-решение, и оно влияет на весь бюджет распространения. Раз вы готовы вкладываться, оно становится срочным.</w:t>
+        <w:t>При большом рекламном бюджете потолок НПД (200к ₽/мес) упирается быстро. При малом бюджете и органическом росте потолок дальше — поэтому в Phase 0 можно спокойно оставаться на НПД. Открывать ИП на УСН 6% — по триггеру, не заранее.</w:t>
+      </w:r>
+    </w:p>
+    <w:p>
+      <w:pPr>
+        <w:pStyle w:val="ListBullet"/>
+        <w:spacing w:after="60"/>
+        <w:ind w:left="340"/>
+      </w:pPr>
+      <w:r>
+        <w:rPr>
+          <w:rFonts w:ascii="Calibri" w:hAnsi="Calibri"/>
+          <w:b/>
+          <w:i w:val="0"/>
+          <w:color w:val="1A1A1A"/>
+          <w:sz w:val="21"/>
+        </w:rPr>
+        <w:t xml:space="preserve">Триггер перехода: </w:t>
+      </w:r>
+      <w:r>
+        <w:rPr>
+          <w:rFonts w:ascii="Calibri" w:hAnsi="Calibri"/>
+          <w:b w:val="0"/>
+          <w:i w:val="0"/>
+          <w:color w:val="1A1A1A"/>
+          <w:sz w:val="21"/>
+        </w:rPr>
+        <w:t>выручка своих агентов &gt; 150к ₽/мес ИЛИ 5+ готовых сторонних продавцов (тогда нужен legal split — он возможен только на ИП/ООО).</w:t>
+      </w:r>
+    </w:p>
+    <w:p>
+      <w:pPr>
+        <w:keepNext/>
+        <w:spacing w:before="300" w:after="80"/>
+        <w:pBdr>
+          <w:bottom w:val="single" w:sz="6" w:space="2" w:color="0F766E"/>
+        </w:pBdr>
+      </w:pPr>
+      <w:r>
+        <w:rPr>
+          <w:rFonts w:ascii="Calibri" w:hAnsi="Calibri"/>
+          <w:b/>
+          <w:i w:val="0"/>
+          <w:color w:val="0F766E"/>
+          <w:sz w:val="30"/>
+        </w:rPr>
+        <w:t>3. Две воронки: покупатели важнее продавцов</w:t>
       </w:r>
     </w:p>
     <w:tbl>
@@ -504,480 +457,7 @@
       <w:tr>
         <w:tc>
           <w:tcPr>
-            <w:tcW w:type="dxa" w:w="1928"/>
-            <w:shd w:val="clear" w:color="auto" w:fill="0F766E"/>
-          </w:tcPr>
-          <w:p>
-            <w:pPr>
-              <w:spacing w:after="20" w:before="20"/>
-            </w:pPr>
-            <w:r>
-              <w:rPr>
-                <w:rFonts w:ascii="Calibri" w:hAnsi="Calibri"/>
-                <w:b/>
-                <w:i w:val="0"/>
-                <w:color w:val="FFFFFF"/>
-                <w:sz w:val="18"/>
-              </w:rPr>
-            </w:r>
-          </w:p>
-        </w:tc>
-        <w:tc>
-          <w:tcPr>
-            <w:tcW w:type="dxa" w:w="3628"/>
-            <w:shd w:val="clear" w:color="auto" w:fill="0F766E"/>
-          </w:tcPr>
-          <w:p>
-            <w:pPr>
-              <w:spacing w:after="20" w:before="20"/>
-            </w:pPr>
-            <w:r>
-              <w:rPr>
-                <w:rFonts w:ascii="Calibri" w:hAnsi="Calibri"/>
-                <w:b/>
-                <w:i w:val="0"/>
-                <w:color w:val="FFFFFF"/>
-                <w:sz w:val="18"/>
-              </w:rPr>
-              <w:t>Остаться в НПД (Phase 0)</w:t>
-            </w:r>
-          </w:p>
-        </w:tc>
-        <w:tc>
-          <w:tcPr>
-            <w:tcW w:type="dxa" w:w="3628"/>
-            <w:shd w:val="clear" w:color="auto" w:fill="0F766E"/>
-          </w:tcPr>
-          <w:p>
-            <w:pPr>
-              <w:spacing w:after="20" w:before="20"/>
-            </w:pPr>
-            <w:r>
-              <w:rPr>
-                <w:rFonts w:ascii="Calibri" w:hAnsi="Calibri"/>
-                <w:b/>
-                <w:i w:val="0"/>
-                <w:color w:val="FFFFFF"/>
-                <w:sz w:val="18"/>
-              </w:rPr>
-              <w:t>Открыть ИП на УСН 6% (ранний Phase 1)</w:t>
-            </w:r>
-          </w:p>
-        </w:tc>
-      </w:tr>
-      <w:tr>
-        <w:tc>
-          <w:tcPr>
-            <w:tcW w:type="dxa" w:w="1928"/>
-          </w:tcPr>
-          <w:p>
-            <w:pPr>
-              <w:spacing w:after="20" w:before="20"/>
-            </w:pPr>
-            <w:r>
-              <w:rPr>
-                <w:rFonts w:ascii="Calibri" w:hAnsi="Calibri"/>
-                <w:b w:val="0"/>
-                <w:i w:val="0"/>
-                <w:color w:val="1A1A1A"/>
-                <w:sz w:val="18"/>
-              </w:rPr>
-              <w:t>Потолок дохода</w:t>
-            </w:r>
-          </w:p>
-        </w:tc>
-        <w:tc>
-          <w:tcPr>
-            <w:tcW w:type="dxa" w:w="3628"/>
-          </w:tcPr>
-          <w:p>
-            <w:pPr>
-              <w:spacing w:after="20" w:before="20"/>
-            </w:pPr>
-            <w:r>
-              <w:rPr>
-                <w:rFonts w:ascii="Calibri" w:hAnsi="Calibri"/>
-                <w:b w:val="0"/>
-                <w:i w:val="0"/>
-                <w:color w:val="1A1A1A"/>
-                <w:sz w:val="18"/>
-              </w:rPr>
-              <w:t>2.4 млн ₽/год (~200к ₽/мес)</w:t>
-            </w:r>
-          </w:p>
-        </w:tc>
-        <w:tc>
-          <w:tcPr>
-            <w:tcW w:type="dxa" w:w="3628"/>
-          </w:tcPr>
-          <w:p>
-            <w:pPr>
-              <w:spacing w:after="20" w:before="20"/>
-            </w:pPr>
-            <w:r>
-              <w:rPr>
-                <w:rFonts w:ascii="Calibri" w:hAnsi="Calibri"/>
-                <w:b w:val="0"/>
-                <w:i w:val="0"/>
-                <w:color w:val="1A1A1A"/>
-                <w:sz w:val="18"/>
-              </w:rPr>
-              <w:t>60 млн ₽/год</w:t>
-            </w:r>
-          </w:p>
-        </w:tc>
-      </w:tr>
-      <w:tr>
-        <w:tc>
-          <w:tcPr>
-            <w:tcW w:type="dxa" w:w="1928"/>
-          </w:tcPr>
-          <w:p>
-            <w:pPr>
-              <w:spacing w:after="20" w:before="20"/>
-            </w:pPr>
-            <w:r>
-              <w:rPr>
-                <w:rFonts w:ascii="Calibri" w:hAnsi="Calibri"/>
-                <w:b w:val="0"/>
-                <w:i w:val="0"/>
-                <w:color w:val="1A1A1A"/>
-                <w:sz w:val="18"/>
-              </w:rPr>
-              <w:t>Маркетплейс с комиссией</w:t>
-            </w:r>
-          </w:p>
-        </w:tc>
-        <w:tc>
-          <w:tcPr>
-            <w:tcW w:type="dxa" w:w="3628"/>
-          </w:tcPr>
-          <w:p>
-            <w:pPr>
-              <w:spacing w:after="20" w:before="20"/>
-            </w:pPr>
-            <w:r>
-              <w:rPr>
-                <w:rFonts w:ascii="Calibri" w:hAnsi="Calibri"/>
-                <w:b w:val="0"/>
-                <w:i w:val="0"/>
-                <w:color w:val="1A1A1A"/>
-                <w:sz w:val="18"/>
-              </w:rPr>
-              <w:t>Нельзя (422-ФЗ)</w:t>
-            </w:r>
-          </w:p>
-        </w:tc>
-        <w:tc>
-          <w:tcPr>
-            <w:tcW w:type="dxa" w:w="3628"/>
-          </w:tcPr>
-          <w:p>
-            <w:pPr>
-              <w:spacing w:after="20" w:before="20"/>
-            </w:pPr>
-            <w:r>
-              <w:rPr>
-                <w:rFonts w:ascii="Calibri" w:hAnsi="Calibri"/>
-                <w:b w:val="0"/>
-                <w:i w:val="0"/>
-                <w:color w:val="1A1A1A"/>
-                <w:sz w:val="18"/>
-              </w:rPr>
-              <w:t>Можно — split сторонним продавцам</w:t>
-            </w:r>
-          </w:p>
-        </w:tc>
-      </w:tr>
-      <w:tr>
-        <w:tc>
-          <w:tcPr>
-            <w:tcW w:type="dxa" w:w="1928"/>
-          </w:tcPr>
-          <w:p>
-            <w:pPr>
-              <w:spacing w:after="20" w:before="20"/>
-            </w:pPr>
-            <w:r>
-              <w:rPr>
-                <w:rFonts w:ascii="Calibri" w:hAnsi="Calibri"/>
-                <w:b w:val="0"/>
-                <w:i w:val="0"/>
-                <w:color w:val="1A1A1A"/>
-                <w:sz w:val="18"/>
-              </w:rPr>
-              <w:t>Делегирование продаж</w:t>
-            </w:r>
-          </w:p>
-        </w:tc>
-        <w:tc>
-          <w:tcPr>
-            <w:tcW w:type="dxa" w:w="3628"/>
-          </w:tcPr>
-          <w:p>
-            <w:pPr>
-              <w:spacing w:after="20" w:before="20"/>
-            </w:pPr>
-            <w:r>
-              <w:rPr>
-                <w:rFonts w:ascii="Calibri" w:hAnsi="Calibri"/>
-                <w:b w:val="0"/>
-                <w:i w:val="0"/>
-                <w:color w:val="1A1A1A"/>
-                <w:sz w:val="18"/>
-              </w:rPr>
-              <w:t>Только подряд (ГПХ), не штат</w:t>
-            </w:r>
-          </w:p>
-        </w:tc>
-        <w:tc>
-          <w:tcPr>
-            <w:tcW w:type="dxa" w:w="3628"/>
-          </w:tcPr>
-          <w:p>
-            <w:pPr>
-              <w:spacing w:after="20" w:before="20"/>
-            </w:pPr>
-            <w:r>
-              <w:rPr>
-                <w:rFonts w:ascii="Calibri" w:hAnsi="Calibri"/>
-                <w:b w:val="0"/>
-                <w:i w:val="0"/>
-                <w:color w:val="1A1A1A"/>
-                <w:sz w:val="18"/>
-              </w:rPr>
-              <w:t>Подряд + наёмные сотрудники</w:t>
-            </w:r>
-          </w:p>
-        </w:tc>
-      </w:tr>
-      <w:tr>
-        <w:tc>
-          <w:tcPr>
-            <w:tcW w:type="dxa" w:w="1928"/>
-          </w:tcPr>
-          <w:p>
-            <w:pPr>
-              <w:spacing w:after="20" w:before="20"/>
-            </w:pPr>
-            <w:r>
-              <w:rPr>
-                <w:rFonts w:ascii="Calibri" w:hAnsi="Calibri"/>
-                <w:b w:val="0"/>
-                <w:i w:val="0"/>
-                <w:color w:val="1A1A1A"/>
-                <w:sz w:val="18"/>
-              </w:rPr>
-              <w:t>Когда упрётесь при активной рекламе</w:t>
-            </w:r>
-          </w:p>
-        </w:tc>
-        <w:tc>
-          <w:tcPr>
-            <w:tcW w:type="dxa" w:w="3628"/>
-          </w:tcPr>
-          <w:p>
-            <w:pPr>
-              <w:spacing w:after="20" w:before="20"/>
-            </w:pPr>
-            <w:r>
-              <w:rPr>
-                <w:rFonts w:ascii="Calibri" w:hAnsi="Calibri"/>
-                <w:b w:val="0"/>
-                <w:i w:val="0"/>
-                <w:color w:val="1A1A1A"/>
-                <w:sz w:val="18"/>
-              </w:rPr>
-              <w:t>Быстро — за 2-3 мес успеха</w:t>
-            </w:r>
-          </w:p>
-        </w:tc>
-        <w:tc>
-          <w:tcPr>
-            <w:tcW w:type="dxa" w:w="3628"/>
-          </w:tcPr>
-          <w:p>
-            <w:pPr>
-              <w:spacing w:after="20" w:before="20"/>
-            </w:pPr>
-            <w:r>
-              <w:rPr>
-                <w:rFonts w:ascii="Calibri" w:hAnsi="Calibri"/>
-                <w:b w:val="0"/>
-                <w:i w:val="0"/>
-                <w:color w:val="1A1A1A"/>
-                <w:sz w:val="18"/>
-              </w:rPr>
-              <w:t>Запас на годы роста</w:t>
-            </w:r>
-          </w:p>
-        </w:tc>
-      </w:tr>
-      <w:tr>
-        <w:tc>
-          <w:tcPr>
-            <w:tcW w:type="dxa" w:w="1928"/>
-          </w:tcPr>
-          <w:p>
-            <w:pPr>
-              <w:spacing w:after="20" w:before="20"/>
-            </w:pPr>
-            <w:r>
-              <w:rPr>
-                <w:rFonts w:ascii="Calibri" w:hAnsi="Calibri"/>
-                <w:b w:val="0"/>
-                <w:i w:val="0"/>
-                <w:color w:val="1A1A1A"/>
-                <w:sz w:val="18"/>
-              </w:rPr>
-              <w:t>Минусы</w:t>
-            </w:r>
-          </w:p>
-        </w:tc>
-        <w:tc>
-          <w:tcPr>
-            <w:tcW w:type="dxa" w:w="3628"/>
-          </w:tcPr>
-          <w:p>
-            <w:pPr>
-              <w:spacing w:after="20" w:before="20"/>
-            </w:pPr>
-            <w:r>
-              <w:rPr>
-                <w:rFonts w:ascii="Calibri" w:hAnsi="Calibri"/>
-                <w:b w:val="0"/>
-                <w:i w:val="0"/>
-                <w:color w:val="1A1A1A"/>
-                <w:sz w:val="18"/>
-              </w:rPr>
-              <w:t>Простота, но низкий потолок</w:t>
-            </w:r>
-          </w:p>
-        </w:tc>
-        <w:tc>
-          <w:tcPr>
-            <w:tcW w:type="dxa" w:w="3628"/>
-          </w:tcPr>
-          <w:p>
-            <w:pPr>
-              <w:spacing w:after="20" w:before="20"/>
-            </w:pPr>
-            <w:r>
-              <w:rPr>
-                <w:rFonts w:ascii="Calibri" w:hAnsi="Calibri"/>
-                <w:b w:val="0"/>
-                <w:i w:val="0"/>
-                <w:color w:val="1A1A1A"/>
-                <w:sz w:val="18"/>
-              </w:rPr>
-              <w:t>Бухгалтерия, взносы, ККТ/чеки</w:t>
-            </w:r>
-          </w:p>
-        </w:tc>
-      </w:tr>
-    </w:tbl>
-    <w:p>
-      <w:pPr>
-        <w:pStyle w:val="ListBullet"/>
-        <w:spacing w:after="60"/>
-        <w:ind w:left="340"/>
-      </w:pPr>
-      <w:r>
-        <w:rPr>
-          <w:rFonts w:ascii="Calibri" w:hAnsi="Calibri"/>
-          <w:b/>
-          <w:i w:val="0"/>
-          <w:color w:val="1A1A1A"/>
-          <w:sz w:val="21"/>
-        </w:rPr>
-        <w:t xml:space="preserve">Рекомендация: </w:t>
-      </w:r>
-      <w:r>
-        <w:rPr>
-          <w:rFonts w:ascii="Calibri" w:hAnsi="Calibri"/>
-          <w:b w:val="0"/>
-          <w:i w:val="0"/>
-          <w:color w:val="1A1A1A"/>
-          <w:sz w:val="21"/>
-        </w:rPr>
-        <w:t>если всерьёз заливаете бюджет в раскрутку — открыть ИП на УСН 6% заранее, не на пике. Иначе реклама приведёт больше спроса, чем НПД позволит легально принять, и придётся экстренно мигрировать в самый неудобный момент.</w:t>
-      </w:r>
-    </w:p>
-    <w:p>
-      <w:pPr>
-        <w:pStyle w:val="ListBullet"/>
-        <w:spacing w:after="60"/>
-        <w:ind w:left="340"/>
-      </w:pPr>
-      <w:r>
-        <w:rPr>
-          <w:rFonts w:ascii="Calibri" w:hAnsi="Calibri"/>
-          <w:b/>
-          <w:i w:val="0"/>
-          <w:color w:val="1A1A1A"/>
-          <w:sz w:val="21"/>
-        </w:rPr>
-        <w:t xml:space="preserve">Триггер перехода (из стратегии проекта): </w:t>
-      </w:r>
-      <w:r>
-        <w:rPr>
-          <w:rFonts w:ascii="Calibri" w:hAnsi="Calibri"/>
-          <w:b w:val="0"/>
-          <w:i w:val="0"/>
-          <w:color w:val="1A1A1A"/>
-          <w:sz w:val="21"/>
-        </w:rPr>
-        <w:t>5+ готовых сторонних продавцов ИЛИ выручка своих агентов &gt; 150к ₽/мес. При курсе на активную рекламу этот триггер наступит раньше плана — готовиться к нему уже сейчас.</w:t>
-      </w:r>
-    </w:p>
-    <w:p>
-      <w:pPr>
-        <w:keepNext/>
-        <w:spacing w:before="300" w:after="80"/>
-        <w:pBdr>
-          <w:bottom w:val="single" w:sz="6" w:space="2" w:color="0F766E"/>
-        </w:pBdr>
-      </w:pPr>
-      <w:r>
-        <w:rPr>
-          <w:rFonts w:ascii="Calibri" w:hAnsi="Calibri"/>
-          <w:b/>
-          <w:i w:val="0"/>
-          <w:color w:val="0F766E"/>
-          <w:sz w:val="30"/>
-        </w:rPr>
-        <w:t>3. Это две разные воронки, а не одна</w:t>
-      </w:r>
-    </w:p>
-    <w:p>
-      <w:r>
-        <w:rPr>
-          <w:rFonts w:ascii="Calibri" w:hAnsi="Calibri"/>
-          <w:b w:val="0"/>
-          <w:i w:val="0"/>
-          <w:color w:val="1A1A1A"/>
-          <w:sz w:val="21"/>
-        </w:rPr>
-        <w:t>Покупатели и продавцы решают разные задачи и приносят разную ценность. Главная ошибка двустороннего маркетплейса — «растить маркетплейс вообще».</w:t>
-      </w:r>
-    </w:p>
-    <w:tbl>
-      <w:tblPr>
-        <w:tblStyle w:val="TableGrid"/>
-        <w:tblW w:type="auto" w:w="0"/>
-        <w:jc w:val="center"/>
-        <w:tblLayout w:type="autofit"/>
-        <w:tblLook w:firstColumn="1" w:firstRow="1" w:lastColumn="0" w:lastRow="0" w:noHBand="0" w:noVBand="1" w:val="04A0"/>
-      </w:tblPr>
-      <w:tblGrid>
-        <w:gridCol w:w="3362"/>
-        <w:gridCol w:w="3362"/>
-        <w:gridCol w:w="3362"/>
-      </w:tblGrid>
-      <w:tr>
-        <w:tc>
-          <w:tcPr>
-            <w:tcW w:type="dxa" w:w="1814"/>
+            <w:tcW w:type="dxa" w:w="1701"/>
             <w:shd w:val="clear" w:color="auto" w:fill="0F766E"/>
           </w:tcPr>
           <w:p>
@@ -998,7 +478,7 @@
         </w:tc>
         <w:tc>
           <w:tcPr>
-            <w:tcW w:type="dxa" w:w="3969"/>
+            <w:tcW w:type="dxa" w:w="4025"/>
             <w:shd w:val="clear" w:color="auto" w:fill="0F766E"/>
           </w:tcPr>
           <w:p>
@@ -1019,7 +499,7 @@
         </w:tc>
         <w:tc>
           <w:tcPr>
-            <w:tcW w:type="dxa" w:w="3969"/>
+            <w:tcW w:type="dxa" w:w="4025"/>
             <w:shd w:val="clear" w:color="auto" w:fill="0F766E"/>
           </w:tcPr>
           <w:p>
@@ -1042,7 +522,7 @@
       <w:tr>
         <w:tc>
           <w:tcPr>
-            <w:tcW w:type="dxa" w:w="1814"/>
+            <w:tcW w:type="dxa" w:w="1701"/>
           </w:tcPr>
           <w:p>
             <w:pPr>
@@ -1056,13 +536,13 @@
                 <w:color w:val="1A1A1A"/>
                 <w:sz w:val="18"/>
               </w:rPr>
-              <w:t>Приносят деньги сейчас?</w:t>
+              <w:t>Деньги сейчас?</w:t>
             </w:r>
           </w:p>
         </w:tc>
         <w:tc>
           <w:tcPr>
-            <w:tcW w:type="dxa" w:w="3969"/>
+            <w:tcW w:type="dxa" w:w="4025"/>
           </w:tcPr>
           <w:p>
             <w:pPr>
@@ -1082,7 +562,7 @@
         </w:tc>
         <w:tc>
           <w:tcPr>
-            <w:tcW w:type="dxa" w:w="3969"/>
+            <w:tcW w:type="dxa" w:w="4025"/>
           </w:tcPr>
           <w:p>
             <w:pPr>
@@ -1096,7 +576,7 @@
                 <w:color w:val="1A1A1A"/>
                 <w:sz w:val="18"/>
               </w:rPr>
-              <w:t>Нет — бесплатное размещение (422-ФЗ)</w:t>
+              <w:t>Нет — free placement (422-ФЗ)</w:t>
             </w:r>
           </w:p>
         </w:tc>
@@ -1104,7 +584,7 @@
       <w:tr>
         <w:tc>
           <w:tcPr>
-            <w:tcW w:type="dxa" w:w="1814"/>
+            <w:tcW w:type="dxa" w:w="1701"/>
           </w:tcPr>
           <w:p>
             <w:pPr>
@@ -1118,13 +598,13 @@
                 <w:color w:val="1A1A1A"/>
                 <w:sz w:val="18"/>
               </w:rPr>
-              <w:t>Зачем нужны</w:t>
+              <w:t>Зачем</w:t>
             </w:r>
           </w:p>
         </w:tc>
         <w:tc>
           <w:tcPr>
-            <w:tcW w:type="dxa" w:w="3969"/>
+            <w:tcW w:type="dxa" w:w="4025"/>
           </w:tcPr>
           <w:p>
             <w:pPr>
@@ -1138,13 +618,13 @@
                 <w:color w:val="1A1A1A"/>
                 <w:sz w:val="18"/>
               </w:rPr>
-              <w:t>Выручка, валидация, публичные кейсы</w:t>
+              <w:t>Выручка, валидация, кейсы для контента</w:t>
             </w:r>
           </w:p>
         </w:tc>
         <w:tc>
           <w:tcPr>
-            <w:tcW w:type="dxa" w:w="3969"/>
+            <w:tcW w:type="dxa" w:w="4025"/>
           </w:tcPr>
           <w:p>
             <w:pPr>
@@ -1158,7 +638,7 @@
                 <w:color w:val="1A1A1A"/>
                 <w:sz w:val="18"/>
               </w:rPr>
-              <w:t>Живая витрина, ассортимент, задел Phase 1</w:t>
+              <w:t>Живая витрина, задел Phase 1</w:t>
             </w:r>
           </w:p>
         </w:tc>
@@ -1166,7 +646,7 @@
       <w:tr>
         <w:tc>
           <w:tcPr>
-            <w:tcW w:type="dxa" w:w="1814"/>
+            <w:tcW w:type="dxa" w:w="1701"/>
           </w:tcPr>
           <w:p>
             <w:pPr>
@@ -1180,13 +660,13 @@
                 <w:color w:val="1A1A1A"/>
                 <w:sz w:val="18"/>
               </w:rPr>
-              <w:t>Доля усилий / бюджета</w:t>
+              <w:t>Усилия</w:t>
             </w:r>
           </w:p>
         </w:tc>
         <w:tc>
           <w:tcPr>
-            <w:tcW w:type="dxa" w:w="3969"/>
+            <w:tcW w:type="dxa" w:w="4025"/>
           </w:tcPr>
           <w:p>
             <w:pPr>
@@ -1206,7 +686,7 @@
         </w:tc>
         <w:tc>
           <w:tcPr>
-            <w:tcW w:type="dxa" w:w="3969"/>
+            <w:tcW w:type="dxa" w:w="4025"/>
           </w:tcPr>
           <w:p>
             <w:pPr>
@@ -1225,68 +705,6 @@
           </w:p>
         </w:tc>
       </w:tr>
-      <w:tr>
-        <w:tc>
-          <w:tcPr>
-            <w:tcW w:type="dxa" w:w="1814"/>
-          </w:tcPr>
-          <w:p>
-            <w:pPr>
-              <w:spacing w:after="20" w:before="20"/>
-            </w:pPr>
-            <w:r>
-              <w:rPr>
-                <w:rFonts w:ascii="Calibri" w:hAnsi="Calibri"/>
-                <w:b w:val="0"/>
-                <w:i w:val="0"/>
-                <w:color w:val="1A1A1A"/>
-                <w:sz w:val="18"/>
-              </w:rPr>
-              <w:t>Каналы</w:t>
-            </w:r>
-          </w:p>
-        </w:tc>
-        <w:tc>
-          <w:tcPr>
-            <w:tcW w:type="dxa" w:w="3969"/>
-          </w:tcPr>
-          <w:p>
-            <w:pPr>
-              <w:spacing w:after="20" w:before="20"/>
-            </w:pPr>
-            <w:r>
-              <w:rPr>
-                <w:rFonts w:ascii="Calibri" w:hAnsi="Calibri"/>
-                <w:b w:val="0"/>
-                <w:i w:val="0"/>
-                <w:color w:val="1A1A1A"/>
-                <w:sz w:val="18"/>
-              </w:rPr>
-              <w:t>Платный трафик + прямые + контент + партнёры</w:t>
-            </w:r>
-          </w:p>
-        </w:tc>
-        <w:tc>
-          <w:tcPr>
-            <w:tcW w:type="dxa" w:w="3969"/>
-          </w:tcPr>
-          <w:p>
-            <w:pPr>
-              <w:spacing w:after="20" w:before="20"/>
-            </w:pPr>
-            <w:r>
-              <w:rPr>
-                <w:rFonts w:ascii="Calibri" w:hAnsi="Calibri"/>
-                <w:b w:val="0"/>
-                <w:i w:val="0"/>
-                <w:color w:val="1A1A1A"/>
-                <w:sz w:val="18"/>
-              </w:rPr>
-              <w:t>GitHub / Kwork / AI-сообщества (органика)</w:t>
-            </w:r>
-          </w:p>
-        </w:tc>
-      </w:tr>
     </w:tbl>
     <w:p>
       <w:r>
@@ -1297,7 +715,7 @@
           <w:color w:val="3A444B"/>
           <w:sz w:val="21"/>
         </w:rPr>
-        <w:t>Сначала довести 2-3 своих агента до стабильных продаж. Деньги и кейсы оттуда потом сами привлекут продавцов — лучше любого оффера.</w:t>
+        <w:t>В режиме малого бюджета это особенно важно: не распылять время на «рост маркетплейса вообще» — довести 2-3 своих агента до продаж, остальное вырастет из кейсов.</w:t>
       </w:r>
     </w:p>
     <w:p>
@@ -1316,7 +734,7 @@
           <w:color w:val="0F766E"/>
           <w:sz w:val="30"/>
         </w:rPr>
-        <w:t>4. Барьер №1 — доверие и соцдоказательство (решать ДО бюджета)</w:t>
+        <w:t>4. Барьер №1 — доверие (контент его и снимает)</w:t>
       </w:r>
     </w:p>
     <w:p>
@@ -1328,23 +746,7 @@
           <w:color w:val="1A1A1A"/>
           <w:sz w:val="21"/>
         </w:rPr>
-        <w:t>МСБ не боится цены 2000 ₽. Он боится, что AI публично опозорит его: нагрубит клиенту в боте, напишет тупой ответ на отзыв, сольёт лида. При нуле кейсов это возражение убивает конверсию любого канала. Деньги на трафик без снятого недоверия = слив бюджета.</w:t>
-      </w:r>
-    </w:p>
-    <w:p>
-      <w:pPr>
-        <w:keepNext/>
-        <w:spacing w:before="120" w:after="40"/>
-      </w:pPr>
-      <w:r>
-        <w:rPr>
-          <w:rFonts w:ascii="Calibri" w:hAnsi="Calibri"/>
-          <w:b/>
-          <w:i w:val="0"/>
-          <w:color w:val="1A1A1A"/>
-          <w:sz w:val="21"/>
-        </w:rPr>
-        <w:t>Что снимает недоверие (всё это у вас дёшево из-за managed-инфраструктуры):</w:t>
+        <w:t>МСБ боится, что AI публично его опозорит. При нуле кейсов это убивает конверсию. Хорошая новость: в режиме «творчество+контент» доверие и контент — одно и то же действие.</w:t>
       </w:r>
     </w:p>
     <w:p>
@@ -1371,7 +773,7 @@
           <w:color w:val="1A1A1A"/>
           <w:sz w:val="21"/>
         </w:rPr>
-        <w:t>показать готовый результат до оплаты (3 ответа на их реальные отзывы 2ГИС, бот на их FAQ). Managed AI делает это почти бесплатно.</w:t>
+        <w:t>3 готовых ответа на их реальные отзывы до оплаты. Managed AI делает это почти даром.</w:t>
       </w:r>
     </w:p>
     <w:p>
@@ -1388,7 +790,7 @@
           <w:color w:val="1A1A1A"/>
           <w:sz w:val="21"/>
         </w:rPr>
-        <w:t xml:space="preserve">Гарантия результата / возврат денег: </w:t>
+        <w:t xml:space="preserve">Гарантия возврата 14 дней: </w:t>
       </w:r>
       <w:r>
         <w:rPr>
@@ -1398,7 +800,7 @@
           <w:color w:val="1A1A1A"/>
           <w:sz w:val="21"/>
         </w:rPr>
-        <w:t>«не понравилось за 14 дней — вернём». Для подписки 2000 ₽ риск платформы мал, а возражение клиента снимается полностью.</w:t>
+        <w:t>снимает риск клиента, для подписки 2000 ₽ почти ничего не стоит.</w:t>
       </w:r>
     </w:p>
     <w:p>
@@ -1415,7 +817,7 @@
           <w:color w:val="1A1A1A"/>
           <w:sz w:val="21"/>
         </w:rPr>
-        <w:t xml:space="preserve">Concierge-онбординг «настроим за вас»: </w:t>
+        <w:t xml:space="preserve">Каждый кейс → контент: </w:t>
       </w:r>
       <w:r>
         <w:rPr>
@@ -1425,7 +827,7 @@
           <w:color w:val="1A1A1A"/>
           <w:sz w:val="21"/>
         </w:rPr>
-        <w:t>не-технический МСБ не осилит setup сам. Ручная настройка первых клиентов = выше конверсия + живые кейсы. Не масштабируется, но на старте и не нужно.</w:t>
+        <w:t>«салон X: 40 отзывов отвечены за неделю, рейтинг 4.3→4.6». Реальные цифры убеждают лучше рекламы.</w:t>
       </w:r>
     </w:p>
     <w:p>
@@ -1442,7 +844,7 @@
           <w:color w:val="1A1A1A"/>
           <w:sz w:val="21"/>
         </w:rPr>
-        <w:t xml:space="preserve">Публичные кейсы с цифрами + лицо основателя: </w:t>
+        <w:t xml:space="preserve">Лицо основателя: </w:t>
       </w:r>
       <w:r>
         <w:rPr>
@@ -1452,26 +854,7 @@
           <w:color w:val="1A1A1A"/>
           <w:sz w:val="21"/>
         </w:rPr>
-        <w:t>«салон X: 40 отзывов отвечены за неделю, рейтинг 4.3→4.6». Building in public и founder-tone уже выработаны — использовать.</w:t>
-      </w:r>
-    </w:p>
-    <w:p>
-      <w:pPr>
-        <w:spacing w:before="120" w:after="160"/>
-        <w:ind w:left="170"/>
-        <w:pBdr>
-          <w:left w:val="single" w:sz="24" w:space="8" w:color="0F766E"/>
-        </w:pBdr>
-      </w:pPr>
-      <w:r>
-        <w:rPr>
-          <w:rFonts w:ascii="Calibri" w:hAnsi="Calibri"/>
-          <w:b/>
-          <w:i w:val="0"/>
-          <w:color w:val="3A444B"/>
-          <w:sz w:val="21"/>
-        </w:rPr>
-        <w:t>Порядок жёсткий: сначала 3-5 живых кейсов и отлаженный оффер с гарантией, и только потом — масштабирование платного трафика. Иначе платите за клики, которые не конвертятся.</w:t>
+        <w:t>building in public с честными числами вызывает доверие, которого нет у безликой директории.</w:t>
       </w:r>
     </w:p>
     <w:p>
@@ -1490,7 +873,7 @@
           <w:color w:val="0F766E"/>
           <w:sz w:val="30"/>
         </w:rPr>
-        <w:t>5. Витрина — 8 продуктов, у каждого свой клиент и канал</w:t>
+        <w:t>5. Витрина — 8 продуктов, у каждого свой клиент</w:t>
       </w:r>
     </w:p>
     <w:tbl>
@@ -1502,15 +885,14 @@
         <w:tblLook w:firstColumn="1" w:firstRow="1" w:lastColumn="0" w:lastRow="0" w:noHBand="0" w:noVBand="1" w:val="04A0"/>
       </w:tblPr>
       <w:tblGrid>
-        <w:gridCol w:w="2521"/>
-        <w:gridCol w:w="2521"/>
-        <w:gridCol w:w="2521"/>
-        <w:gridCol w:w="2521"/>
+        <w:gridCol w:w="3362"/>
+        <w:gridCol w:w="3362"/>
+        <w:gridCol w:w="3362"/>
       </w:tblGrid>
       <w:tr>
         <w:tc>
           <w:tcPr>
-            <w:tcW w:type="dxa" w:w="2551"/>
+            <w:tcW w:type="dxa" w:w="2608"/>
             <w:shd w:val="clear" w:color="auto" w:fill="0F766E"/>
           </w:tcPr>
           <w:p>
@@ -1531,7 +913,7 @@
         </w:tc>
         <w:tc>
           <w:tcPr>
-            <w:tcW w:type="dxa" w:w="2494"/>
+            <w:tcW w:type="dxa" w:w="2608"/>
             <w:shd w:val="clear" w:color="auto" w:fill="0F766E"/>
           </w:tcPr>
           <w:p>
@@ -1552,7 +934,7 @@
         </w:tc>
         <w:tc>
           <w:tcPr>
-            <w:tcW w:type="dxa" w:w="1871"/>
+            <w:tcW w:type="dxa" w:w="3402"/>
             <w:shd w:val="clear" w:color="auto" w:fill="0F766E"/>
           </w:tcPr>
           <w:p>
@@ -1567,28 +949,7 @@
                 <w:color w:val="FFFFFF"/>
                 <w:sz w:val="18"/>
               </w:rPr>
-              <w:t>Где он есть</w:t>
-            </w:r>
-          </w:p>
-        </w:tc>
-        <w:tc>
-          <w:tcPr>
-            <w:tcW w:type="dxa" w:w="2835"/>
-            <w:shd w:val="clear" w:color="auto" w:fill="0F766E"/>
-          </w:tcPr>
-          <w:p>
-            <w:pPr>
-              <w:spacing w:after="20" w:before="20"/>
-            </w:pPr>
-            <w:r>
-              <w:rPr>
-                <w:rFonts w:ascii="Calibri" w:hAnsi="Calibri"/>
-                <w:b/>
-                <w:i w:val="0"/>
-                <w:color w:val="FFFFFF"/>
-                <w:sz w:val="18"/>
-              </w:rPr>
-              <w:t>Как зайти</w:t>
+              <w:t>Контент/канал захода</w:t>
             </w:r>
           </w:p>
         </w:tc>
@@ -1596,7 +957,7 @@
       <w:tr>
         <w:tc>
           <w:tcPr>
-            <w:tcW w:type="dxa" w:w="2551"/>
+            <w:tcW w:type="dxa" w:w="2608"/>
           </w:tcPr>
           <w:p>
             <w:pPr>
@@ -1616,7 +977,7 @@
         </w:tc>
         <w:tc>
           <w:tcPr>
-            <w:tcW w:type="dxa" w:w="2494"/>
+            <w:tcW w:type="dxa" w:w="2608"/>
           </w:tcPr>
           <w:p>
             <w:pPr>
@@ -1630,13 +991,13 @@
                 <w:color w:val="1A1A1A"/>
                 <w:sz w:val="17"/>
               </w:rPr>
-              <w:t>Локальный бизнес: кафе, салоны, клиники, автосервисы, отели</w:t>
+              <w:t>Кафе, салоны, клиники, автосервисы, отели</w:t>
             </w:r>
           </w:p>
         </w:tc>
         <w:tc>
           <w:tcPr>
-            <w:tcW w:type="dxa" w:w="1871"/>
+            <w:tcW w:type="dxa" w:w="3402"/>
           </w:tcPr>
           <w:p>
             <w:pPr>
@@ -1650,13 +1011,15 @@
                 <w:color w:val="1A1A1A"/>
                 <w:sz w:val="17"/>
               </w:rPr>
-              <w:t>2ГИС, Я.Карты, Авито</w:t>
+              <w:t>Аутрич + видео «AI ответил за 3 сек» + лид-магнит</w:t>
             </w:r>
           </w:p>
         </w:tc>
+      </w:tr>
+      <w:tr>
         <w:tc>
           <w:tcPr>
-            <w:tcW w:type="dxa" w:w="2835"/>
+            <w:tcW w:type="dxa" w:w="2608"/>
           </w:tcPr>
           <w:p>
             <w:pPr>
@@ -1670,15 +1033,13 @@
                 <w:color w:val="1A1A1A"/>
                 <w:sz w:val="17"/>
               </w:rPr>
-              <w:t>Прямой аутрич: парсинг карточек с неотвеченными отзывами</w:t>
+              <w:t>Бот поддержки TG 24/7 · 2990 ₽</w:t>
             </w:r>
           </w:p>
         </w:tc>
-      </w:tr>
-      <w:tr>
         <w:tc>
           <w:tcPr>
-            <w:tcW w:type="dxa" w:w="2551"/>
+            <w:tcW w:type="dxa" w:w="2608"/>
           </w:tcPr>
           <w:p>
             <w:pPr>
@@ -1692,13 +1053,13 @@
                 <w:color w:val="1A1A1A"/>
                 <w:sz w:val="17"/>
               </w:rPr>
-              <w:t>Бот поддержки в TG 24/7 · 2990 ₽</w:t>
+              <w:t>E-commerce и услуги с потоком вопросов в TG</w:t>
             </w:r>
           </w:p>
         </w:tc>
         <w:tc>
           <w:tcPr>
-            <w:tcW w:type="dxa" w:w="2494"/>
+            <w:tcW w:type="dxa" w:w="3402"/>
           </w:tcPr>
           <w:p>
             <w:pPr>
@@ -1712,47 +1073,7 @@
                 <w:color w:val="1A1A1A"/>
                 <w:sz w:val="17"/>
               </w:rPr>
-              <w:t>E-commerce и услуги с потоком вопросов в Telegram</w:t>
-            </w:r>
-          </w:p>
-        </w:tc>
-        <w:tc>
-          <w:tcPr>
-            <w:tcW w:type="dxa" w:w="1871"/>
-          </w:tcPr>
-          <w:p>
-            <w:pPr>
-              <w:spacing w:after="20" w:before="20"/>
-            </w:pPr>
-            <w:r>
-              <w:rPr>
-                <w:rFonts w:ascii="Calibri" w:hAnsi="Calibri"/>
-                <w:b w:val="0"/>
-                <w:i w:val="0"/>
-                <w:color w:val="1A1A1A"/>
-                <w:sz w:val="17"/>
-              </w:rPr>
-              <w:t>TG-магазины, инфобиз, бизнес-чаты</w:t>
-            </w:r>
-          </w:p>
-        </w:tc>
-        <w:tc>
-          <w:tcPr>
-            <w:tcW w:type="dxa" w:w="2835"/>
-          </w:tcPr>
-          <w:p>
-            <w:pPr>
-              <w:spacing w:after="20" w:before="20"/>
-            </w:pPr>
-            <w:r>
-              <w:rPr>
-                <w:rFonts w:ascii="Calibri" w:hAnsi="Calibri"/>
-                <w:b w:val="0"/>
-                <w:i w:val="0"/>
-                <w:color w:val="1A1A1A"/>
-                <w:sz w:val="17"/>
-              </w:rPr>
-              <w:t>Питч магазинам + Директ + посевы</w:t>
+              <w:t>Кейсы «бот закрыл вопросы ночью» + посевы</w:t>
             </w:r>
           </w:p>
         </w:tc>
@@ -1760,7 +1081,7 @@
       <w:tr>
         <w:tc>
           <w:tcPr>
-            <w:tcW w:type="dxa" w:w="2551"/>
+            <w:tcW w:type="dxa" w:w="2608"/>
           </w:tcPr>
           <w:p>
             <w:pPr>
@@ -1780,7 +1101,7 @@
         </w:tc>
         <w:tc>
           <w:tcPr>
-            <w:tcW w:type="dxa" w:w="2494"/>
+            <w:tcW w:type="dxa" w:w="2608"/>
           </w:tcPr>
           <w:p>
             <w:pPr>
@@ -1800,7 +1121,7 @@
         </w:tc>
         <w:tc>
           <w:tcPr>
-            <w:tcW w:type="dxa" w:w="1871"/>
+            <w:tcW w:type="dxa" w:w="3402"/>
           </w:tcPr>
           <w:p>
             <w:pPr>
@@ -1814,27 +1135,7 @@
                 <w:color w:val="1A1A1A"/>
                 <w:sz w:val="17"/>
               </w:rPr>
-              <w:t>Сам Telegram, SMM-чаты</w:t>
-            </w:r>
-          </w:p>
-        </w:tc>
-        <w:tc>
-          <w:tcPr>
-            <w:tcW w:type="dxa" w:w="2835"/>
-          </w:tcPr>
-          <w:p>
-            <w:pPr>
-              <w:spacing w:after="20" w:before="20"/>
-            </w:pPr>
-            <w:r>
-              <w:rPr>
-                <w:rFonts w:ascii="Calibri" w:hAnsi="Calibri"/>
-                <w:b w:val="0"/>
-                <w:i w:val="0"/>
-                <w:color w:val="1A1A1A"/>
-                <w:sz w:val="17"/>
-              </w:rPr>
-              <w:t>Дешёвый = пробник бренда; посевы, каталоги каналов</w:t>
+              <w:t>ВЕДЁТ наш канал = живое демо; SMM-чаты</w:t>
             </w:r>
           </w:p>
         </w:tc>
@@ -1842,7 +1143,7 @@
       <w:tr>
         <w:tc>
           <w:tcPr>
-            <w:tcW w:type="dxa" w:w="2551"/>
+            <w:tcW w:type="dxa" w:w="2608"/>
           </w:tcPr>
           <w:p>
             <w:pPr>
@@ -1862,7 +1163,7 @@
         </w:tc>
         <w:tc>
           <w:tcPr>
-            <w:tcW w:type="dxa" w:w="2494"/>
+            <w:tcW w:type="dxa" w:w="2608"/>
           </w:tcPr>
           <w:p>
             <w:pPr>
@@ -1876,13 +1177,13 @@
                 <w:color w:val="1A1A1A"/>
                 <w:sz w:val="17"/>
               </w:rPr>
-              <w:t>Отделы продаж, агентства, B2B с потоком лидов</w:t>
+              <w:t>Отделы продаж, B2B с потоком лидов</w:t>
             </w:r>
           </w:p>
         </w:tc>
         <w:tc>
           <w:tcPr>
-            <w:tcW w:type="dxa" w:w="1871"/>
+            <w:tcW w:type="dxa" w:w="3402"/>
           </w:tcPr>
           <w:p>
             <w:pPr>
@@ -1896,27 +1197,7 @@
                 <w:color w:val="1A1A1A"/>
                 <w:sz w:val="17"/>
               </w:rPr>
-              <w:t>Сообщества amoCRM/Битрикс</w:t>
-            </w:r>
-          </w:p>
-        </w:tc>
-        <w:tc>
-          <w:tcPr>
-            <w:tcW w:type="dxa" w:w="2835"/>
-          </w:tcPr>
-          <w:p>
-            <w:pPr>
-              <w:spacing w:after="20" w:before="20"/>
-            </w:pPr>
-            <w:r>
-              <w:rPr>
-                <w:rFonts w:ascii="Calibri" w:hAnsi="Calibri"/>
-                <w:b w:val="0"/>
-                <w:i w:val="0"/>
-                <w:color w:val="1A1A1A"/>
-                <w:sz w:val="17"/>
-              </w:rPr>
-              <w:t>Канал партнёров: CRM-интеграторы</w:t>
+              <w:t>Партнёры-интеграторы + кейс-контент</w:t>
             </w:r>
           </w:p>
         </w:tc>
@@ -1924,7 +1205,7 @@
       <w:tr>
         <w:tc>
           <w:tcPr>
-            <w:tcW w:type="dxa" w:w="2551"/>
+            <w:tcW w:type="dxa" w:w="2608"/>
           </w:tcPr>
           <w:p>
             <w:pPr>
@@ -1944,7 +1225,7 @@
         </w:tc>
         <w:tc>
           <w:tcPr>
-            <w:tcW w:type="dxa" w:w="2494"/>
+            <w:tcW w:type="dxa" w:w="2608"/>
           </w:tcPr>
           <w:p>
             <w:pPr>
@@ -1958,13 +1239,13 @@
                 <w:color w:val="1A1A1A"/>
                 <w:sz w:val="17"/>
               </w:rPr>
-              <w:t>Бизнес с колл-центром, перформанс-маркетинг</w:t>
+              <w:t>Бизнес с колл-центром, перформанс</w:t>
             </w:r>
           </w:p>
         </w:tc>
         <w:tc>
           <w:tcPr>
-            <w:tcW w:type="dxa" w:w="1871"/>
+            <w:tcW w:type="dxa" w:w="3402"/>
           </w:tcPr>
           <w:p>
             <w:pPr>
@@ -1978,27 +1259,7 @@
                 <w:color w:val="1A1A1A"/>
                 <w:sz w:val="17"/>
               </w:rPr>
-              <w:t>Roistat-комьюнити, маркетинг-чаты</w:t>
-            </w:r>
-          </w:p>
-        </w:tc>
-        <w:tc>
-          <w:tcPr>
-            <w:tcW w:type="dxa" w:w="2835"/>
-          </w:tcPr>
-          <w:p>
-            <w:pPr>
-              <w:spacing w:after="20" w:before="20"/>
-            </w:pPr>
-            <w:r>
-              <w:rPr>
-                <w:rFonts w:ascii="Calibri" w:hAnsi="Calibri"/>
-                <w:b w:val="0"/>
-                <w:i w:val="0"/>
-                <w:color w:val="1A1A1A"/>
-                <w:sz w:val="17"/>
-              </w:rPr>
-              <w:t>Партнёры Roistat + кейс-контент</w:t>
+              <w:t>Партнёры Roistat + разбор-контент</w:t>
             </w:r>
           </w:p>
         </w:tc>
@@ -2006,7 +1267,7 @@
       <w:tr>
         <w:tc>
           <w:tcPr>
-            <w:tcW w:type="dxa" w:w="2551"/>
+            <w:tcW w:type="dxa" w:w="2608"/>
           </w:tcPr>
           <w:p>
             <w:pPr>
@@ -2026,7 +1287,7 @@
         </w:tc>
         <w:tc>
           <w:tcPr>
-            <w:tcW w:type="dxa" w:w="2494"/>
+            <w:tcW w:type="dxa" w:w="2608"/>
           </w:tcPr>
           <w:p>
             <w:pPr>
@@ -2046,7 +1307,7 @@
         </w:tc>
         <w:tc>
           <w:tcPr>
-            <w:tcW w:type="dxa" w:w="1871"/>
+            <w:tcW w:type="dxa" w:w="3402"/>
           </w:tcPr>
           <w:p>
             <w:pPr>
@@ -2060,27 +1321,7 @@
                 <w:color w:val="1A1A1A"/>
                 <w:sz w:val="17"/>
               </w:rPr>
-              <w:t>Маркетинг- и e-com сообщества</w:t>
-            </w:r>
-          </w:p>
-        </w:tc>
-        <w:tc>
-          <w:tcPr>
-            <w:tcW w:type="dxa" w:w="2835"/>
-          </w:tcPr>
-          <w:p>
-            <w:pPr>
-              <w:spacing w:after="20" w:before="20"/>
-            </w:pPr>
-            <w:r>
-              <w:rPr>
-                <w:rFonts w:ascii="Calibri" w:hAnsi="Calibri"/>
-                <w:b w:val="0"/>
-                <w:i w:val="0"/>
-                <w:color w:val="1A1A1A"/>
-                <w:sz w:val="17"/>
-              </w:rPr>
-              <w:t>Контент + Директ под интент</w:t>
+              <w:t>Контент «как следить за конкурентами»</w:t>
             </w:r>
           </w:p>
         </w:tc>
@@ -2088,7 +1329,7 @@
       <w:tr>
         <w:tc>
           <w:tcPr>
-            <w:tcW w:type="dxa" w:w="2551"/>
+            <w:tcW w:type="dxa" w:w="2608"/>
           </w:tcPr>
           <w:p>
             <w:pPr>
@@ -2108,7 +1349,7 @@
         </w:tc>
         <w:tc>
           <w:tcPr>
-            <w:tcW w:type="dxa" w:w="2494"/>
+            <w:tcW w:type="dxa" w:w="2608"/>
           </w:tcPr>
           <w:p>
             <w:pPr>
@@ -2122,13 +1363,13 @@
                 <w:color w:val="1A1A1A"/>
                 <w:sz w:val="17"/>
               </w:rPr>
-              <w:t>Веб-студии, агентства, IT, SaaS</w:t>
+              <w:t>Веб-студии, агентства, IT</w:t>
             </w:r>
           </w:p>
         </w:tc>
         <w:tc>
           <w:tcPr>
-            <w:tcW w:type="dxa" w:w="1871"/>
+            <w:tcW w:type="dxa" w:w="3402"/>
           </w:tcPr>
           <w:p>
             <w:pPr>
@@ -2142,27 +1383,7 @@
                 <w:color w:val="1A1A1A"/>
                 <w:sz w:val="17"/>
               </w:rPr>
-              <w:t>Habr, IT/SRE-чаты</w:t>
-            </w:r>
-          </w:p>
-        </w:tc>
-        <w:tc>
-          <w:tcPr>
-            <w:tcW w:type="dxa" w:w="2835"/>
-          </w:tcPr>
-          <w:p>
-            <w:pPr>
-              <w:spacing w:after="20" w:before="20"/>
-            </w:pPr>
-            <w:r>
-              <w:rPr>
-                <w:rFonts w:ascii="Calibri" w:hAnsi="Calibri"/>
-                <w:b w:val="0"/>
-                <w:i w:val="0"/>
-                <w:color w:val="1A1A1A"/>
-                <w:sz w:val="17"/>
-              </w:rPr>
-              <w:t>Дешёвый технический; контент на Habr</w:t>
+              <w:t>Habr + IT-чаты, дешёвый технический</w:t>
             </w:r>
           </w:p>
         </w:tc>
@@ -2170,7 +1391,7 @@
       <w:tr>
         <w:tc>
           <w:tcPr>
-            <w:tcW w:type="dxa" w:w="2551"/>
+            <w:tcW w:type="dxa" w:w="2608"/>
           </w:tcPr>
           <w:p>
             <w:pPr>
@@ -2190,7 +1411,7 @@
         </w:tc>
         <w:tc>
           <w:tcPr>
-            <w:tcW w:type="dxa" w:w="2494"/>
+            <w:tcW w:type="dxa" w:w="2608"/>
           </w:tcPr>
           <w:p>
             <w:pPr>
@@ -2204,13 +1425,13 @@
                 <w:color w:val="1A1A1A"/>
                 <w:sz w:val="17"/>
               </w:rPr>
-              <w:t>Медиа, отраслевые и нишевые каналы</w:t>
+              <w:t>Медиа, нишевые каналы</w:t>
             </w:r>
           </w:p>
         </w:tc>
         <w:tc>
           <w:tcPr>
-            <w:tcW w:type="dxa" w:w="1871"/>
+            <w:tcW w:type="dxa" w:w="3402"/>
           </w:tcPr>
           <w:p>
             <w:pPr>
@@ -2224,27 +1445,7 @@
                 <w:color w:val="1A1A1A"/>
                 <w:sz w:val="17"/>
               </w:rPr>
-              <w:t>Telegram</w:t>
-            </w:r>
-          </w:p>
-        </w:tc>
-        <w:tc>
-          <w:tcPr>
-            <w:tcW w:type="dxa" w:w="2835"/>
-          </w:tcPr>
-          <w:p>
-            <w:pPr>
-              <w:spacing w:after="20" w:before="20"/>
-            </w:pPr>
-            <w:r>
-              <w:rPr>
-                <w:rFonts w:ascii="Calibri" w:hAnsi="Calibri"/>
-                <w:b w:val="0"/>
-                <w:i w:val="0"/>
-                <w:color w:val="1A1A1A"/>
-                <w:sz w:val="17"/>
-              </w:rPr>
-              <w:t>Каталоги каналов, нишевые посевы</w:t>
+              <w:t>ВЕДЁТ демо-канал; каталоги каналов</w:t>
             </w:r>
           </w:p>
         </w:tc>
@@ -2266,7 +1467,7 @@
           <w:color w:val="3A444B"/>
           <w:sz w:val="21"/>
         </w:rPr>
-        <w:t>3 локомотива первых 60 дней (ясная боль + достижимая ЦА + дешёвый вход): ответы 2ГИС, бот поддержки, копирайтер. Остальные 5 — через партнёров и контент, без активного бюджета.</w:t>
+        <w:t>3 локомотива первых 60 дней: ответы 2ГИС (аутрич+видео), бот поддержки (кейсы), копирайтер (dogfooding-канал). Копирайтер и дайджест уникальны — они сами себя демонстрируют, ведя наши каналы.</w:t>
       </w:r>
     </w:p>
     <w:p>
@@ -2285,23 +1486,19 @@
           <w:color w:val="0F766E"/>
           <w:sz w:val="30"/>
         </w:rPr>
-        <w:t>6. Каналы: матрица под «вкладываемся любыми способами»</w:t>
+        <w:t>6. Рычаг №1: агенты ведут маркетинг Hireon (dogfooding)</w:t>
       </w:r>
     </w:p>
     <w:p>
-      <w:pPr>
-        <w:keepNext/>
-        <w:spacing w:before="200" w:after="60"/>
-      </w:pPr>
       <w:r>
         <w:rPr>
           <w:rFonts w:ascii="Calibri" w:hAnsi="Calibri"/>
-          <w:b/>
+          <w:b w:val="0"/>
           <w:i w:val="0"/>
-          <w:color w:val="3A444B"/>
-          <w:sz w:val="23"/>
+          <w:color w:val="1A1A1A"/>
+          <w:sz w:val="21"/>
         </w:rPr>
-        <w:t>6.1. Платные (главное ускорение — но после валидации на 1 агенте)</w:t>
+        <w:t>Самое дешёвое и самое убедительное одновременно. Продукт — контент-агенты, поэтому ими же производится маркетинг:</w:t>
       </w:r>
     </w:p>
     <w:p>
@@ -2318,7 +1515,7 @@
           <w:color w:val="1A1A1A"/>
           <w:sz w:val="21"/>
         </w:rPr>
-        <w:t xml:space="preserve">Яндекс.Директ (поиск) — канал №1 для РФ-B2B: </w:t>
+        <w:t xml:space="preserve">Канал-витрина ведёт агент-копирайтер: </w:t>
       </w:r>
       <w:r>
         <w:rPr>
@@ -2328,7 +1525,7 @@
           <w:color w:val="1A1A1A"/>
           <w:sz w:val="21"/>
         </w:rPr>
-        <w:t>ловит готовый интент («автоответы на отзывы 2гис», «чат-бот поддержки телеграм»). Под каждый агент — своя кампания и лендинг. Старт-тест 50-100к ₽, мерить CAC.</w:t>
+        <w:t>Telegram/VK/Дзен Hireon наполняет собственный агент (990 ₽/мес). Подпись «этот пост написал наш агент» = демо + доказательство. Захотел так же — вот кнопка.</w:t>
       </w:r>
     </w:p>
     <w:p>
@@ -2345,7 +1542,7 @@
           <w:color w:val="1A1A1A"/>
           <w:sz w:val="21"/>
         </w:rPr>
-        <w:t xml:space="preserve">РСЯ + ретаргетинг Яндекса: </w:t>
+        <w:t xml:space="preserve">Отраслевые дайджесты — агентом-дайджестом: </w:t>
       </w:r>
       <w:r>
         <w:rPr>
@@ -2355,7 +1552,7 @@
           <w:color w:val="1A1A1A"/>
           <w:sz w:val="21"/>
         </w:rPr>
-        <w:t>догонять тех, кто был на лендинге, но не купил. Дёшево, обязательно при любом трафике.</w:t>
+        <w:t>«AI и автоматизация для малого бизнеса» собирается и пишется автоматически. И трафик, и витрина продукта.</w:t>
       </w:r>
     </w:p>
     <w:p>
@@ -2372,7 +1569,7 @@
           <w:color w:val="1A1A1A"/>
           <w:sz w:val="21"/>
         </w:rPr>
-        <w:t xml:space="preserve">VK Реклама: </w:t>
+        <w:t xml:space="preserve">Ответы на отзывы Hireon (когда появятся) — агентом-2ГИС. </w:t>
       </w:r>
       <w:r>
         <w:rPr>
@@ -2382,7 +1579,7 @@
           <w:color w:val="1A1A1A"/>
           <w:sz w:val="21"/>
         </w:rPr>
-        <w:t>таргет на бизнес-аудиторию и подписчиков профильных сообществ (конкуренты, ниши). Главный соцсеть-таргет РФ после ухода Meta.</w:t>
+        <w:t>Любая публичная коммуникация бренда = демонстрация соответствующего агента.</w:t>
       </w:r>
     </w:p>
     <w:p>
@@ -2399,7 +1596,7 @@
           <w:color w:val="1A1A1A"/>
           <w:sz w:val="21"/>
         </w:rPr>
-        <w:t xml:space="preserve">Telegram Ads (через реселлера eLama и пр.): </w:t>
+        <w:t xml:space="preserve">Честная рамка: </w:t>
       </w:r>
       <w:r>
         <w:rPr>
@@ -2409,7 +1606,23 @@
           <w:color w:val="1A1A1A"/>
           <w:sz w:val="21"/>
         </w:rPr>
-        <w:t>вход от €250-500 (не €2M напрямую), CPM от €0.7, оплата по факту. Таргет на тематические каналы. Маркировка ЕРИР — на стороне реселлера.</w:t>
+        <w:t>не выдавать AI за человека там, где это вводит в заблуждение. Наоборот — открытость «это сделал наш агент» и есть селлинг-пойнт.</w:t>
+      </w:r>
+    </w:p>
+    <w:p>
+      <w:pPr>
+        <w:keepNext/>
+        <w:spacing w:before="200" w:after="60"/>
+      </w:pPr>
+      <w:r>
+        <w:rPr>
+          <w:rFonts w:ascii="Calibri" w:hAnsi="Calibri"/>
+          <w:b/>
+          <w:i w:val="0"/>
+          <w:color w:val="3A444B"/>
+          <w:sz w:val="23"/>
+        </w:rPr>
+        <w:t>Творческие форматы (максимум охвата на ноль бюджета)</w:t>
       </w:r>
     </w:p>
     <w:p>
@@ -2426,7 +1639,7 @@
           <w:color w:val="1A1A1A"/>
           <w:sz w:val="21"/>
         </w:rPr>
-        <w:t xml:space="preserve">Посевы в Telegram-каналах: </w:t>
+        <w:t xml:space="preserve">Building in public: </w:t>
       </w:r>
       <w:r>
         <w:rPr>
@@ -2436,7 +1649,7 @@
           <w:color w:val="1A1A1A"/>
           <w:sz w:val="21"/>
         </w:rPr>
-        <w:t>закупка постов в нишевых каналах (предприниматели, рестораторы, бьюти, e-com). Гибче и часто дешевле Ads. РФ-специфика. Не забыть erid-маркировку поста.</w:t>
+        <w:t>founder-дневник с выручкой, провалами, цифрами (Telegram + VC.ru + Дзен). Главный органический двигатель.</w:t>
       </w:r>
     </w:p>
     <w:p>
@@ -2453,7 +1666,7 @@
           <w:color w:val="1A1A1A"/>
           <w:sz w:val="21"/>
         </w:rPr>
-        <w:t xml:space="preserve">eLama как единый кабинет: </w:t>
+        <w:t xml:space="preserve">Короткие вертикальные видео: </w:t>
       </w:r>
       <w:r>
         <w:rPr>
@@ -2463,35 +1676,7 @@
           <w:color w:val="1A1A1A"/>
           <w:sz w:val="21"/>
         </w:rPr>
-        <w:t>Директ + VK + Telegram Ads из одного окна с авто-маркировкой и закрывающими — экономит время соло-founder'а.</w:t>
-      </w:r>
-    </w:p>
-    <w:p>
-      <w:r>
-        <w:rPr>
-          <w:rFonts w:ascii="Calibri" w:hAnsi="Calibri"/>
-          <w:b w:val="0"/>
-          <w:i/>
-          <w:color w:val="9B2C2C"/>
-          <w:sz w:val="21"/>
-        </w:rPr>
-        <w:t>Недоступно в РФ — не тратить время: Google Ads (не работает с РФ), таргет в Meta/Instagram/X (запрещён, штрафы).</w:t>
-      </w:r>
-    </w:p>
-    <w:p>
-      <w:pPr>
-        <w:keepNext/>
-        <w:spacing w:before="200" w:after="60"/>
-      </w:pPr>
-      <w:r>
-        <w:rPr>
-          <w:rFonts w:ascii="Calibri" w:hAnsi="Calibri"/>
-          <w:b/>
-          <w:i w:val="0"/>
-          <w:color w:val="3A444B"/>
-          <w:sz w:val="23"/>
-        </w:rPr>
-        <w:t>6.2. Прямые продажи (для холодного старта и масштабируемы подрядом)</w:t>
+        <w:t>«AI ответил клиенту за 3 секунды», «бот закрыл 10 вопросов ночью» — VK Клипы, YouTube Shorts, Rutube, Дзен-ролики. Дёшево, рекомендательные ленты дают органический охват.</w:t>
       </w:r>
     </w:p>
     <w:p>
@@ -2508,7 +1693,7 @@
           <w:color w:val="1A1A1A"/>
           <w:sz w:val="21"/>
         </w:rPr>
-        <w:t xml:space="preserve">Founder-led outbound — первые 10-20 клиентов руками. </w:t>
+        <w:t xml:space="preserve">Публичные разборы реального бизнеса: </w:t>
       </w:r>
       <w:r>
         <w:rPr>
@@ -2518,7 +1703,7 @@
           <w:color w:val="1A1A1A"/>
           <w:sz w:val="21"/>
         </w:rPr>
-        <w:t>Норма seed-стадии (Stripe, Airbnb так начинали) и самый быстрый способ узнать реальные возражения.</w:t>
+        <w:t>берём задачу живого МСБ → агент решает → показываем результат. И контент, и лид (бизнес становится кейсом/клиентом).</w:t>
       </w:r>
     </w:p>
     <w:p>
@@ -2535,7 +1720,7 @@
           <w:color w:val="1A1A1A"/>
           <w:sz w:val="21"/>
         </w:rPr>
-        <w:t xml:space="preserve">Механика «Ответы 2ГИС»: </w:t>
+        <w:t xml:space="preserve">Челлендж-серии: </w:t>
       </w:r>
       <w:r>
         <w:rPr>
@@ -2545,7 +1730,7 @@
           <w:color w:val="1A1A1A"/>
           <w:sz w:val="21"/>
         </w:rPr>
-        <w:t>парсинг карточек с рейтингом 4.0-4.6 и пачкой неотвеченных отзывов (боль видна) → заход с готовым демо-ответом → 2000 ₽/мес, неделя бесплатно. 50 персонализированных заходов → ожидаемо 2-6 платящих (cold B2B 3-8% при демо).</w:t>
+        <w:t>«30 дней — 30 задач малого бизнеса, решённых AI» — по агенту в день с реальным результатом. Сериальность держит аудиторию.</w:t>
       </w:r>
     </w:p>
     <w:p>
@@ -2562,7 +1747,7 @@
           <w:color w:val="1A1A1A"/>
           <w:sz w:val="21"/>
         </w:rPr>
-        <w:t xml:space="preserve">Масштабирование без личного времени: </w:t>
+        <w:t xml:space="preserve">Лид-магниты-польза: </w:t>
       </w:r>
       <w:r>
         <w:rPr>
@@ -2572,7 +1757,7 @@
           <w:color w:val="1A1A1A"/>
           <w:sz w:val="21"/>
         </w:rPr>
-        <w:t>аутрич делегируется подрядчикам по ГПХ/самозанятым или сейлз-агентству (НПД не запрещает подряд). Скрипт + демо стандартизируются.</w:t>
+        <w:t>«100 готовых ответов на отзывы 2ГИС», «промпты для бизнеса», шаблоны — расходятся органически, собирают целевую базу.</w:t>
       </w:r>
     </w:p>
     <w:p>
@@ -2589,7 +1774,7 @@
           <w:color w:val="1A1A1A"/>
           <w:sz w:val="21"/>
         </w:rPr>
-        <w:t xml:space="preserve">Легальность: </w:t>
+        <w:t xml:space="preserve">AI-визуал под editorial-стиль: </w:t>
       </w:r>
       <w:r>
         <w:rPr>
@@ -2599,7 +1784,26 @@
           <w:color w:val="1A1A1A"/>
           <w:sz w:val="21"/>
         </w:rPr>
-        <w:t>холодный обзвон/рассылка — соблюдать 152-ФЗ и ст. 18 ФЗ-38 (реклама по сетям связи требует согласия). Безопаснее — заход через публичные контакты карточки и форму, а не массовый спам.</w:t>
+        <w:t>постеры через Kandinsky/Шедеврум (бесплатно, РФ) и Midjourney. Соло выдаёт объём как агентство.</w:t>
+      </w:r>
+    </w:p>
+    <w:p>
+      <w:pPr>
+        <w:keepNext/>
+        <w:spacing w:before="300" w:after="80"/>
+        <w:pBdr>
+          <w:bottom w:val="single" w:sz="6" w:space="2" w:color="0F766E"/>
+        </w:pBdr>
+      </w:pPr>
+      <w:r>
+        <w:rPr>
+          <w:rFonts w:ascii="Calibri" w:hAnsi="Calibri"/>
+          <w:b/>
+          <w:i w:val="0"/>
+          <w:color w:val="0F766E"/>
+          <w:sz w:val="30"/>
+        </w:rPr>
+        <w:t>7. Каналы: соцсети и органика впереди, платное — точечно</w:t>
       </w:r>
     </w:p>
     <w:p>
@@ -2615,7 +1819,7 @@
           <w:color w:val="3A444B"/>
           <w:sz w:val="23"/>
         </w:rPr>
-        <w:t>6.3. Органика (легальная для РФ, долгий бесплатный трафик)</w:t>
+        <w:t>7.1. Соцсети (легальные РФ) — ядро</w:t>
       </w:r>
     </w:p>
     <w:p>
@@ -2632,7 +1836,7 @@
           <w:color w:val="1A1A1A"/>
           <w:sz w:val="21"/>
         </w:rPr>
-        <w:t xml:space="preserve">Telegram-канал проекта (build in public): </w:t>
+        <w:t xml:space="preserve">Telegram: </w:t>
       </w:r>
       <w:r>
         <w:rPr>
@@ -2642,7 +1846,7 @@
           <w:color w:val="1A1A1A"/>
           <w:sz w:val="21"/>
         </w:rPr>
-        <w:t>честный дневник — выручка, что сработало и нет, разборы, кейсы. Ядро бренда. Регулярность важнее объёма.</w:t>
+        <w:t>канал-витрина (ведёт агент) + участие в нишевых чатах через пользу. Ядро бренда и продаж.</w:t>
       </w:r>
     </w:p>
     <w:p>
@@ -2659,7 +1863,7 @@
           <w:color w:val="1A1A1A"/>
           <w:sz w:val="21"/>
         </w:rPr>
-        <w:t xml:space="preserve">VC.ru и Habr — лонгриды: </w:t>
+        <w:t xml:space="preserve">VK: </w:t>
       </w:r>
       <w:r>
         <w:rPr>
@@ -2669,7 +1873,104 @@
           <w:color w:val="1A1A1A"/>
           <w:sz w:val="21"/>
         </w:rPr>
-        <w:t>VC.ru для покупателей и фаундеров, Habr (тех-разбор: Docker-изоляция, managed-ключи) для продавцов-разработчиков. Легальны и работают для РФ-аудитории.</w:t>
+        <w:t>сообщество + VK Клипы (органический охват). Главная соцсеть РФ после ухода Meta.</w:t>
+      </w:r>
+    </w:p>
+    <w:p>
+      <w:pPr>
+        <w:pStyle w:val="ListBullet"/>
+        <w:spacing w:after="60"/>
+        <w:ind w:left="340"/>
+      </w:pPr>
+      <w:r>
+        <w:rPr>
+          <w:rFonts w:ascii="Calibri" w:hAnsi="Calibri"/>
+          <w:b/>
+          <w:i w:val="0"/>
+          <w:color w:val="1A1A1A"/>
+          <w:sz w:val="21"/>
+        </w:rPr>
+        <w:t xml:space="preserve">Дзен (Яндекс): </w:t>
+      </w:r>
+      <w:r>
+        <w:rPr>
+          <w:rFonts w:ascii="Calibri" w:hAnsi="Calibri"/>
+          <w:b w:val="0"/>
+          <w:i w:val="0"/>
+          <w:color w:val="1A1A1A"/>
+          <w:sz w:val="21"/>
+        </w:rPr>
+        <w:t>статьи и ролики, сильная рекомендательная лента — шанс на органическую вирусность без бюджета.</w:t>
+      </w:r>
+    </w:p>
+    <w:p>
+      <w:pPr>
+        <w:pStyle w:val="ListBullet"/>
+        <w:spacing w:after="60"/>
+        <w:ind w:left="340"/>
+      </w:pPr>
+      <w:r>
+        <w:rPr>
+          <w:rFonts w:ascii="Calibri" w:hAnsi="Calibri"/>
+          <w:b/>
+          <w:i w:val="0"/>
+          <w:color w:val="1A1A1A"/>
+          <w:sz w:val="21"/>
+        </w:rPr>
+        <w:t xml:space="preserve">YouTube / VK Видео / Rutube: </w:t>
+      </w:r>
+      <w:r>
+        <w:rPr>
+          <w:rFonts w:ascii="Calibri" w:hAnsi="Calibri"/>
+          <w:b w:val="0"/>
+          <w:i w:val="0"/>
+          <w:color w:val="1A1A1A"/>
+          <w:sz w:val="21"/>
+        </w:rPr>
+        <w:t>демо и Shorts. Видео снимает недоверие к AI лучше текста.</w:t>
+      </w:r>
+    </w:p>
+    <w:p>
+      <w:pPr>
+        <w:keepNext/>
+        <w:spacing w:before="200" w:after="60"/>
+      </w:pPr>
+      <w:r>
+        <w:rPr>
+          <w:rFonts w:ascii="Calibri" w:hAnsi="Calibri"/>
+          <w:b/>
+          <w:i w:val="0"/>
+          <w:color w:val="3A444B"/>
+          <w:sz w:val="23"/>
+        </w:rPr>
+        <w:t>7.2. Контент-органика (бесплатный трафик вдолгую)</w:t>
+      </w:r>
+    </w:p>
+    <w:p>
+      <w:pPr>
+        <w:pStyle w:val="ListBullet"/>
+        <w:spacing w:after="60"/>
+        <w:ind w:left="340"/>
+      </w:pPr>
+      <w:r>
+        <w:rPr>
+          <w:rFonts w:ascii="Calibri" w:hAnsi="Calibri"/>
+          <w:b/>
+          <w:i w:val="0"/>
+          <w:color w:val="1A1A1A"/>
+          <w:sz w:val="21"/>
+        </w:rPr>
+        <w:t xml:space="preserve">VC.ru и Habr: </w:t>
+      </w:r>
+      <w:r>
+        <w:rPr>
+          <w:rFonts w:ascii="Calibri" w:hAnsi="Calibri"/>
+          <w:b w:val="0"/>
+          <w:i w:val="0"/>
+          <w:color w:val="1A1A1A"/>
+          <w:sz w:val="21"/>
+        </w:rPr>
+        <w:t>VC.ru — для покупателей и фаундеров, Habr — тех-разбор для продавцов-разработчиков.</w:t>
       </w:r>
     </w:p>
     <w:p>
@@ -2696,7 +1997,23 @@
           <w:color w:val="1A1A1A"/>
           <w:sz w:val="21"/>
         </w:rPr>
-        <w:t>стек на Next.js (SSG, sitemap готов). Лендинги под интент + справочные статьи («как отвечать на негативные отзывы»). Горизонт 3-6 мес — запускать сейчас.</w:t>
+        <w:t>Next.js уже даёт SSG/sitemap. Лендинги под интент + справочные статьи. Горизонт 3-6 мес — начинать сейчас.</w:t>
+      </w:r>
+    </w:p>
+    <w:p>
+      <w:pPr>
+        <w:keepNext/>
+        <w:spacing w:before="200" w:after="60"/>
+      </w:pPr>
+      <w:r>
+        <w:rPr>
+          <w:rFonts w:ascii="Calibri" w:hAnsi="Calibri"/>
+          <w:b/>
+          <w:i w:val="0"/>
+          <w:color w:val="3A444B"/>
+          <w:sz w:val="23"/>
+        </w:rPr>
+        <w:t>7.3. Прямые продажи (0 ₽, дают первые кейсы)</w:t>
       </w:r>
     </w:p>
     <w:p>
@@ -2713,7 +2030,7 @@
           <w:color w:val="1A1A1A"/>
           <w:sz w:val="21"/>
         </w:rPr>
-        <w:t xml:space="preserve">YouTube / VK Видео / Rutube: </w:t>
+        <w:t xml:space="preserve">Founder-аутрич по 2ГИС: </w:t>
       </w:r>
       <w:r>
         <w:rPr>
@@ -2723,7 +2040,7 @@
           <w:color w:val="1A1A1A"/>
           <w:sz w:val="21"/>
         </w:rPr>
-        <w:t>короткие демо «как настроить агента за 5 минут». Видео снимает недоверие лучше текста.</w:t>
+        <w:t>парсинг карточек с неотвеченными отзывами → заход с готовым демо-ответом → неделя бесплатно. 50 заходов → 2-6 платящих. Каждый клиент → контент-кейс.</w:t>
       </w:r>
     </w:p>
     <w:p>
@@ -2739,7 +2056,7 @@
           <w:color w:val="3A444B"/>
           <w:sz w:val="23"/>
         </w:rPr>
-        <w:t>6.4. Партнёры и каталоги (рычаг чужой базы)</w:t>
+        <w:t>7.4. Платное — микро-тесты (только после органической валидации)</w:t>
       </w:r>
     </w:p>
     <w:p>
@@ -2756,7 +2073,7 @@
           <w:color w:val="1A1A1A"/>
           <w:sz w:val="21"/>
         </w:rPr>
-        <w:t xml:space="preserve">CRM-интеграторы (amoCRM, Битрикс24), партнёры Roistat: </w:t>
+        <w:t xml:space="preserve">Telegram-посевы: </w:t>
       </w:r>
       <w:r>
         <w:rPr>
@@ -2766,7 +2083,7 @@
           <w:color w:val="1A1A1A"/>
           <w:sz w:val="21"/>
         </w:rPr>
-        <w:t>перепродают дорогие агенты (лид-квалификатор, аналитик звонков) своей базе МСБ. Им — реф-вознаграждение вне платформы / промокод (split внутри платформы в Phase 0 нельзя).</w:t>
+        <w:t>5-15к ₽ за пост в 2-3 нишевых каналах ЦА. Самый дешёвый платный вход. Маркировка erid обязательна.</w:t>
       </w:r>
     </w:p>
     <w:p>
@@ -2783,7 +2100,7 @@
           <w:color w:val="1A1A1A"/>
           <w:sz w:val="21"/>
         </w:rPr>
-        <w:t xml:space="preserve">SMM-агентства и веб-студии: </w:t>
+        <w:t xml:space="preserve">Дзен-промо / VK Реклама: </w:t>
       </w:r>
       <w:r>
         <w:rPr>
@@ -2793,7 +2110,7 @@
           <w:color w:val="1A1A1A"/>
           <w:sz w:val="21"/>
         </w:rPr>
-        <w:t>допродают копирайтера и бота поддержки клиентам как услугу «под ключ».</w:t>
+        <w:t>малый бюджет на усиление контента, который уже зашёл органически.</w:t>
       </w:r>
     </w:p>
     <w:p>
@@ -2810,7 +2127,7 @@
           <w:color w:val="1A1A1A"/>
           <w:sz w:val="21"/>
         </w:rPr>
-        <w:t xml:space="preserve">Lock-In Agency (бартер, в планах): </w:t>
+        <w:t xml:space="preserve">Яндекс.Директ: </w:t>
       </w:r>
       <w:r>
         <w:rPr>
@@ -2820,111 +2137,19 @@
           <w:color w:val="1A1A1A"/>
           <w:sz w:val="21"/>
         </w:rPr>
-        <w:t>агенты под заказ → каталог. Описать процесс: запрос → разработка → каталог → кто платит.</w:t>
+        <w:t>минимальный бюджет на горячий интент только для агента-победителя. Не размазывать.</w:t>
       </w:r>
     </w:p>
     <w:p>
-      <w:pPr>
-        <w:pStyle w:val="ListBullet"/>
-        <w:spacing w:after="60"/>
-        <w:ind w:left="340"/>
-      </w:pPr>
-      <w:r>
-        <w:rPr>
-          <w:rFonts w:ascii="Calibri" w:hAnsi="Calibri"/>
-          <w:b/>
-          <w:i w:val="0"/>
-          <w:color w:val="1A1A1A"/>
-          <w:sz w:val="21"/>
-        </w:rPr>
-        <w:t xml:space="preserve">Каталоги и PR: </w:t>
-      </w:r>
       <w:r>
         <w:rPr>
           <w:rFonts w:ascii="Calibri" w:hAnsi="Calibri"/>
           <w:b w:val="0"/>
-          <w:i w:val="0"/>
-          <w:color w:val="1A1A1A"/>
+          <w:i/>
+          <w:color w:val="9B2C2C"/>
           <w:sz w:val="21"/>
         </w:rPr>
-        <w:t>РФ SaaS-каталоги (Startpack и подобные), AI-директории (рус + en), питч в РФ tech-медиа про стартапы.</w:t>
-      </w:r>
-    </w:p>
-    <w:p>
-      <w:pPr>
-        <w:keepNext/>
-        <w:spacing w:before="200" w:after="60"/>
-      </w:pPr>
-      <w:r>
-        <w:rPr>
-          <w:rFonts w:ascii="Calibri" w:hAnsi="Calibri"/>
-          <w:b/>
-          <w:i w:val="0"/>
-          <w:color w:val="3A444B"/>
-          <w:sz w:val="23"/>
-        </w:rPr>
-        <w:t>6.5. Продавцы (20% усилий, задел Phase 1)</w:t>
-      </w:r>
-    </w:p>
-    <w:p>
-      <w:pPr>
-        <w:pStyle w:val="ListBullet"/>
-        <w:spacing w:after="60"/>
-        <w:ind w:left="340"/>
-      </w:pPr>
-      <w:r>
-        <w:rPr>
-          <w:rFonts w:ascii="Calibri" w:hAnsi="Calibri"/>
-          <w:b/>
-          <w:i w:val="0"/>
-          <w:color w:val="1A1A1A"/>
-          <w:sz w:val="21"/>
-        </w:rPr>
-        <w:t xml:space="preserve">Сильный оффер: </w:t>
-      </w:r>
-      <w:r>
-        <w:rPr>
-          <w:rFonts w:ascii="Calibri" w:hAnsi="Calibri"/>
-          <w:b w:val="0"/>
-          <w:i w:val="0"/>
-          <w:color w:val="1A1A1A"/>
-          <w:sz w:val="21"/>
-        </w:rPr>
-        <w:t>«Бесплатно, 0% комиссии. Хостинг, AI-ключи, биллинг и клиенты — на нас. Ты приносишь только код». Снимает всю не-кодовую боль разработчика.</w:t>
-      </w:r>
-    </w:p>
-    <w:p>
-      <w:pPr>
-        <w:pStyle w:val="ListBullet"/>
-        <w:spacing w:after="60"/>
-        <w:ind w:left="340"/>
-      </w:pPr>
-      <w:r>
-        <w:rPr>
-          <w:rFonts w:ascii="Calibri" w:hAnsi="Calibri"/>
-          <w:b w:val="0"/>
-          <w:i w:val="0"/>
-          <w:color w:val="1A1A1A"/>
-          <w:sz w:val="21"/>
-        </w:rPr>
-        <w:t>Где искать (легально, без запрещённых платформ): авторы Telegram/AI-ботов на GitHub (50-500 звёзд, MIT/Apache), Kwork/Habr Freelance, AI-сообщества в Telegram.</w:t>
-      </w:r>
-    </w:p>
-    <w:p>
-      <w:pPr>
-        <w:pStyle w:val="ListBullet"/>
-        <w:spacing w:after="60"/>
-        <w:ind w:left="340"/>
-      </w:pPr>
-      <w:r>
-        <w:rPr>
-          <w:rFonts w:ascii="Calibri" w:hAnsi="Calibri"/>
-          <w:b w:val="0"/>
-          <w:i w:val="0"/>
-          <w:color w:val="1A1A1A"/>
-          <w:sz w:val="21"/>
-        </w:rPr>
-        <w:t>Использовать готовый sellers-quickstart как онбординг. Честно: это free placement + boost, НЕ комиссия с продаж (это Phase 1 после ИП).</w:t>
+        <w:t>Недоступно/нелегально в РФ — не тратить время: Google Ads, любой таргет в Meta/Instagram/X.</w:t>
       </w:r>
     </w:p>
     <w:p>
@@ -2943,19 +2168,7 @@
           <w:color w:val="0F766E"/>
           <w:sz w:val="30"/>
         </w:rPr>
-        <w:t>7. Экономика каналов и бюджетная дисциплина</w:t>
-      </w:r>
-    </w:p>
-    <w:p>
-      <w:r>
-        <w:rPr>
-          <w:rFonts w:ascii="Calibri" w:hAnsi="Calibri"/>
-          <w:b w:val="0"/>
-          <w:i w:val="0"/>
-          <w:color w:val="1A1A1A"/>
-          <w:sz w:val="21"/>
-        </w:rPr>
-        <w:t>«Любыми способами» работает, только если каждый рубль рекламы измеряется. Порядок действий защищает ваши же деньги.</w:t>
+        <w:t>8. Бюджет и приоритеты (малый бюджет = время и креатив вперёд)</w:t>
       </w:r>
     </w:p>
     <w:p>
@@ -2972,7 +2185,7 @@
           <w:color w:val="1A1A1A"/>
           <w:sz w:val="21"/>
         </w:rPr>
-        <w:t xml:space="preserve">Прикидка юнит-экономики: </w:t>
+        <w:t xml:space="preserve">Правило денег: </w:t>
       </w:r>
       <w:r>
         <w:rPr>
@@ -2982,7 +2195,7 @@
           <w:color w:val="1A1A1A"/>
           <w:sz w:val="21"/>
         </w:rPr>
-        <w:t>подписка 2000-6200 ₽/мес × retention хотя бы 4-6 мес = LTV 8-37к ₽. Значит допустимый CAC ~2-8к ₽. При нём платный трафик окупается — если лендинг конвертит. Сначала проверить конверсию, потом лить.</w:t>
+        <w:t>платим за канал только после того, как органика на том же агенте дала платящих. Платное усиливает доказанное, а не ищет вслепую.</w:t>
       </w:r>
     </w:p>
     <w:p>
@@ -2999,7 +2212,7 @@
           <w:color w:val="1A1A1A"/>
           <w:sz w:val="21"/>
         </w:rPr>
-        <w:t xml:space="preserve">Тестовый бюджет на канал: </w:t>
+        <w:t xml:space="preserve">Юнит-экономика: </w:t>
       </w:r>
       <w:r>
         <w:rPr>
@@ -3009,7 +2222,7 @@
           <w:color w:val="1A1A1A"/>
           <w:sz w:val="21"/>
         </w:rPr>
-        <w:t>50-100к ₽ на канал, единая цель — стоимость платящего клиента (CAC). Масштабировать только победителя, остальные — стоп.</w:t>
+        <w:t>подписка 2000-6200 ₽ × retention 4-6 мес = LTV 8-37к ₽ → допустимый CAC 2-8к ₽. Но при малом бюджете цель — держать CAC около нуля за счёт органики и dogfooding.</w:t>
       </w:r>
     </w:p>
     <w:p>
@@ -3026,7 +2239,7 @@
           <w:color w:val="1A1A1A"/>
           <w:sz w:val="21"/>
         </w:rPr>
-        <w:t xml:space="preserve">Последовательность, а не всё сразу: </w:t>
+        <w:t xml:space="preserve">Где тратить первые деньги, если очень нужно: </w:t>
       </w:r>
       <w:r>
         <w:rPr>
@@ -3036,7 +2249,7 @@
           <w:color w:val="1A1A1A"/>
           <w:sz w:val="21"/>
         </w:rPr>
-        <w:t>(1) органика + прямые продажи валидируют 1 агента и дают кейсы; (2) Яндекс.Директ на этом агенте; (3) масштаб бюджета и новые каналы на том, что уже окупается.</w:t>
+        <w:t>1) AI-инструменты (подписки на генерацию) ; 2) Telegram-посев на победителе ; 3) дизайн обложек/видео. Именно в таком порядке.</w:t>
       </w:r>
     </w:p>
     <w:p>
@@ -3053,7 +2266,7 @@
           <w:color w:val="1A1A1A"/>
           <w:sz w:val="21"/>
         </w:rPr>
-        <w:t xml:space="preserve">Не забыть +3% сбор и комиссию реселлера </w:t>
+        <w:t xml:space="preserve">Главная метрика режима: </w:t>
       </w:r>
       <w:r>
         <w:rPr>
@@ -3063,7 +2276,7 @@
           <w:color w:val="1A1A1A"/>
           <w:sz w:val="21"/>
         </w:rPr>
-        <w:t>в расчёте CAC — реальная стоимость клика выше номинала.</w:t>
+        <w:t>стоит ли за неделю контента хотя бы 1-2 входящих лида. Если канал не даёт лидов 3-4 недели — менять формат, а не бюджет.</w:t>
       </w:r>
     </w:p>
     <w:p>
@@ -3082,7 +2295,7 @@
           <w:color w:val="0F766E"/>
           <w:sz w:val="30"/>
         </w:rPr>
-        <w:t>8. План первых 90 дней</w:t>
+        <w:t>9. План первых 90 дней</w:t>
       </w:r>
     </w:p>
     <w:p>
@@ -3098,7 +2311,7 @@
           <w:color w:val="1A1A1A"/>
           <w:sz w:val="21"/>
         </w:rPr>
-        <w:t>Неделя 0 — фундамент (без этого нельзя лить трафик)</w:t>
+        <w:t>Неделя 0 — фундамент</w:t>
       </w:r>
     </w:p>
     <w:p>
@@ -3115,7 +2328,7 @@
           <w:color w:val="1A1A1A"/>
           <w:sz w:val="21"/>
         </w:rPr>
-        <w:t>E2E-проверка оплаты своей картой (checkout → деплой → recurring).</w:t>
+        <w:t>E2E-проверка оплаты своей картой. Аналитика (Я.Метрика) + табличка лидов.</w:t>
       </w:r>
     </w:p>
     <w:p>
@@ -3132,7 +2345,23 @@
           <w:color w:val="1A1A1A"/>
           <w:sz w:val="21"/>
         </w:rPr>
-        <w:t>Решение по юр.форме: НПД или сразу ИП УСН 6% (см. раздел 2).</w:t>
+        <w:t>Настроить агента-копирайтера на ведение Telegram/VK/Дзен Hireon (dogfooding-канал).</w:t>
+      </w:r>
+    </w:p>
+    <w:p>
+      <w:pPr>
+        <w:keepNext/>
+        <w:spacing w:before="120" w:after="40"/>
+      </w:pPr>
+      <w:r>
+        <w:rPr>
+          <w:rFonts w:ascii="Calibri" w:hAnsi="Calibri"/>
+          <w:b/>
+          <w:i w:val="0"/>
+          <w:color w:val="1A1A1A"/>
+          <w:sz w:val="21"/>
+        </w:rPr>
+        <w:t>Дни 1-30 — контент-машина + первый локомотив</w:t>
       </w:r>
     </w:p>
     <w:p>
@@ -3149,23 +2378,7 @@
           <w:color w:val="1A1A1A"/>
           <w:sz w:val="21"/>
         </w:rPr>
-        <w:t>Аналитика (Я.Метрика), CRM-табличка лидов, регистрация в ЕРИР/через eLama для маркировки.</w:t>
-      </w:r>
-    </w:p>
-    <w:p>
-      <w:pPr>
-        <w:keepNext/>
-        <w:spacing w:before="120" w:after="40"/>
-      </w:pPr>
-      <w:r>
-        <w:rPr>
-          <w:rFonts w:ascii="Calibri" w:hAnsi="Calibri"/>
-          <w:b/>
-          <w:i w:val="0"/>
-          <w:color w:val="1A1A1A"/>
-          <w:sz w:val="21"/>
-        </w:rPr>
-        <w:t>Дни 1-30 — валидация на локомотиве (ответы 2ГИС)</w:t>
+        <w:t>Запустить канал-витрину (агент пишет) + building-in-public дневник + 1 лонгрид VC.ru.</w:t>
       </w:r>
     </w:p>
     <w:p>
@@ -3182,7 +2395,7 @@
           <w:color w:val="1A1A1A"/>
           <w:sz w:val="21"/>
         </w:rPr>
-        <w:t>100-150 целевых бизнесов парсингом 2ГИС → 50 заходов с демо.</w:t>
+        <w:t>5-8 коротких видео «AI решает задачу» (2ГИС/бот). Аутрич: 50 заходов по 2ГИС с демо.</w:t>
       </w:r>
     </w:p>
     <w:p>
@@ -3199,24 +2412,7 @@
           <w:color w:val="1A1A1A"/>
           <w:sz w:val="21"/>
         </w:rPr>
-        <w:t>Запустить Telegram-канал + 1 лонгрид VC.ru + 3 SEO-лендинга (2ГИС, бот, копирайтер).</w:t>
-      </w:r>
-    </w:p>
-    <w:p>
-      <w:pPr>
-        <w:pStyle w:val="ListBullet"/>
-        <w:spacing w:after="60"/>
-        <w:ind w:left="340"/>
-      </w:pPr>
-      <w:r>
-        <w:rPr>
-          <w:rFonts w:ascii="Calibri" w:hAnsi="Calibri"/>
-          <w:b w:val="0"/>
-          <w:i w:val="0"/>
-          <w:color w:val="1A1A1A"/>
-          <w:sz w:val="21"/>
-        </w:rPr>
-        <w:t>Оффер с гарантией возврата + concierge-онбординг первых клиентов.</w:t>
+        <w:t>Лид-магнит «100 ответов на отзывы 2ГИС». Оффер с гарантией возврата.</w:t>
       </w:r>
     </w:p>
     <w:p>
@@ -3243,7 +2439,7 @@
           <w:color w:val="1A1A1A"/>
           <w:sz w:val="21"/>
         </w:rPr>
-        <w:t>3-5 платящих, 2 публичных кейса, отлаженный скрипт продажи.</w:t>
+        <w:t>3-5 платящих, 3 кейса, отлаженные 1-2 контент-формата.</w:t>
       </w:r>
     </w:p>
     <w:p>
@@ -3259,7 +2455,7 @@
           <w:color w:val="1A1A1A"/>
           <w:sz w:val="21"/>
         </w:rPr>
-        <w:t>Дни 31-60 — включить платное на том, что сработало</w:t>
+        <w:t>Дни 31-60 — усилить то, что зашло</w:t>
       </w:r>
     </w:p>
     <w:p>
@@ -3276,7 +2472,7 @@
           <w:color w:val="1A1A1A"/>
           <w:sz w:val="21"/>
         </w:rPr>
-        <w:t>Яндекс.Директ + ретаргет на агента-победителя (тест 50-100к ₽), мерить CAC.</w:t>
+        <w:t>Удвоить лучший контент-формат, добавить публичные разборы реального бизнеса.</w:t>
       </w:r>
     </w:p>
     <w:p>
@@ -3293,24 +2489,7 @@
           <w:color w:val="1A1A1A"/>
           <w:sz w:val="21"/>
         </w:rPr>
-        <w:t>Второй локомотив (бот поддержки), 1-2 партнёрских разговора (amoCRM/SMM).</w:t>
-      </w:r>
-    </w:p>
-    <w:p>
-      <w:pPr>
-        <w:pStyle w:val="ListBullet"/>
-        <w:spacing w:after="60"/>
-        <w:ind w:left="340"/>
-      </w:pPr>
-      <w:r>
-        <w:rPr>
-          <w:rFonts w:ascii="Calibri" w:hAnsi="Calibri"/>
-          <w:b w:val="0"/>
-          <w:i w:val="0"/>
-          <w:color w:val="1A1A1A"/>
-          <w:sz w:val="21"/>
-        </w:rPr>
-        <w:t>Делегировать аутрич подрядчику. Кейс-пост в неделю.</w:t>
+        <w:t>Микро-тест: Telegram-посев 5-15к ₽ на агента-победителя. 1-2 партнёра (SMM/интегратор).</w:t>
       </w:r>
     </w:p>
     <w:p>
@@ -3337,7 +2516,7 @@
           <w:color w:val="1A1A1A"/>
           <w:sz w:val="21"/>
         </w:rPr>
-        <w:t>10-15 платящих, понятная экономика канала (CAC/LTV).</w:t>
+        <w:t>10-15 платящих, понятно какой формат и канал дают лиды.</w:t>
       </w:r>
     </w:p>
     <w:p>
@@ -3353,7 +2532,7 @@
           <w:color w:val="1A1A1A"/>
           <w:sz w:val="21"/>
         </w:rPr>
-        <w:t>Дни 61-90 — масштаб и система</w:t>
+        <w:t>Дни 61-90 — система</w:t>
       </w:r>
     </w:p>
     <w:p>
@@ -3370,7 +2549,7 @@
           <w:color w:val="1A1A1A"/>
           <w:sz w:val="21"/>
         </w:rPr>
-        <w:t>Масштабировать платный канал-победитель, добавить VK Реклама / Telegram-посевы.</w:t>
+        <w:t>Контент-серии на потоке (агент + founder). Усилить победивший платный микро-канал.</w:t>
       </w:r>
     </w:p>
     <w:p>
@@ -3387,24 +2566,7 @@
           <w:color w:val="1A1A1A"/>
           <w:sz w:val="21"/>
         </w:rPr>
-        <w:t>Партнёрская механика (реф/промокод), аутрич 10-15 продавцам (2-3 новых агента).</w:t>
-      </w:r>
-    </w:p>
-    <w:p>
-      <w:pPr>
-        <w:pStyle w:val="ListBullet"/>
-        <w:spacing w:after="60"/>
-        <w:ind w:left="340"/>
-      </w:pPr>
-      <w:r>
-        <w:rPr>
-          <w:rFonts w:ascii="Calibri" w:hAnsi="Calibri"/>
-          <w:b w:val="0"/>
-          <w:i w:val="0"/>
-          <w:color w:val="1A1A1A"/>
-          <w:sz w:val="21"/>
-        </w:rPr>
-        <w:t>Если выручка близка к 150-200к ₽/мес — запускать оформление ИП.</w:t>
+        <w:t>Аутрич 10-15 продавцам (2-3 новых агента). Решение про ИП — по триггеру выручки.</w:t>
       </w:r>
     </w:p>
     <w:p>
@@ -3431,7 +2593,7 @@
           <w:color w:val="1A1A1A"/>
           <w:sz w:val="21"/>
         </w:rPr>
-        <w:t>20-40 платящих, минимум один платный канал с LTV/CAC &gt; 3.</w:t>
+        <w:t>20-30 платящих, 1-2 органических канала со стабильным притоком лидов.</w:t>
       </w:r>
     </w:p>
     <w:p>
@@ -3450,7 +2612,7 @@
           <w:color w:val="0F766E"/>
           <w:sz w:val="30"/>
         </w:rPr>
-        <w:t>9. Метрики и триггеры</w:t>
+        <w:t>10. Метрики и триггеры</w:t>
       </w:r>
     </w:p>
     <w:p>
@@ -3467,7 +2629,7 @@
           <w:color w:val="1A1A1A"/>
           <w:sz w:val="21"/>
         </w:rPr>
-        <w:t>Воронка по шагам: визит → клик «подключить» → checkout начат → оплачен → задеплоен → жив через 30 дней. Чинить место, где отваливается.</w:t>
+        <w:t>Воронка: визит → клик «подключить» → checkout → оплачен → задеплоен → жив через 30 дней.</w:t>
       </w:r>
     </w:p>
     <w:p>
@@ -3484,7 +2646,7 @@
           <w:color w:val="1A1A1A"/>
           <w:sz w:val="21"/>
         </w:rPr>
-        <w:t>На канал: CAC, доля платящих, окупаемость (LTV/CAC). На агента: что продаётся, что нет.</w:t>
+        <w:t>На контент-формат: лиды на пост/видео. Убивать форматы без лидов за 3-4 недели.</w:t>
       </w:r>
     </w:p>
     <w:p>
@@ -3501,7 +2663,7 @@
           <w:color w:val="1A1A1A"/>
           <w:sz w:val="21"/>
         </w:rPr>
-        <w:t xml:space="preserve">Платный масштаб: </w:t>
+        <w:t xml:space="preserve">Платный микро-тест масштабировать: </w:t>
       </w:r>
       <w:r>
         <w:rPr>
@@ -3511,7 +2673,7 @@
           <w:color w:val="1A1A1A"/>
           <w:sz w:val="21"/>
         </w:rPr>
-        <w:t>только при LTV/CAC &gt; 3 на канале.</w:t>
+        <w:t>только при положительной окупаемости на победителе.</w:t>
       </w:r>
     </w:p>
     <w:p>
@@ -3528,7 +2690,7 @@
           <w:color w:val="1A1A1A"/>
           <w:sz w:val="21"/>
         </w:rPr>
-        <w:t xml:space="preserve">Переход в Phase 1 (ИП + комиссия + split): </w:t>
+        <w:t xml:space="preserve">Phase 1 (ИП + комиссия + split): </w:t>
       </w:r>
       <w:r>
         <w:rPr>
@@ -3538,7 +2700,7 @@
           <w:color w:val="1A1A1A"/>
           <w:sz w:val="21"/>
         </w:rPr>
-        <w:t>5+ готовых продавцов ИЛИ &gt; 150к ₽/мес со своих агентов. При активной рекламе — наступит раньше, готовиться заранее.</w:t>
+        <w:t>5+ продавцов ИЛИ &gt; 150к ₽/мес со своих агентов.</w:t>
       </w:r>
     </w:p>
     <w:p>
@@ -3557,34 +2719,7 @@
           <w:color w:val="0F766E"/>
           <w:sz w:val="30"/>
         </w:rPr>
-        <w:t>10. Анти-паттерны (чего НЕ делать)</w:t>
-      </w:r>
-    </w:p>
-    <w:p>
-      <w:pPr>
-        <w:pStyle w:val="ListBullet"/>
-        <w:spacing w:after="60"/>
-        <w:ind w:left="340"/>
-      </w:pPr>
-      <w:r>
-        <w:rPr>
-          <w:rFonts w:ascii="Calibri" w:hAnsi="Calibri"/>
-          <w:b/>
-          <w:i w:val="0"/>
-          <w:color w:val="1A1A1A"/>
-          <w:sz w:val="21"/>
-        </w:rPr>
-        <w:t xml:space="preserve">Не рекламироваться в Instagram/Facebook/X/Reddit/Discord/LinkedIn — </w:t>
-      </w:r>
-      <w:r>
-        <w:rPr>
-          <w:rFonts w:ascii="Calibri" w:hAnsi="Calibri"/>
-          <w:b w:val="0"/>
-          <w:i w:val="0"/>
-          <w:color w:val="1A1A1A"/>
-          <w:sz w:val="21"/>
-        </w:rPr>
-        <w:t>запрещено (ФЗ-72), штрафы. Старый план это предлагал — игнорировать.</w:t>
+        <w:t>11. Анти-паттерны</w:t>
       </w:r>
     </w:p>
     <w:p>
@@ -3601,7 +2736,7 @@
           <w:color w:val="1A1A1A"/>
           <w:sz w:val="21"/>
         </w:rPr>
-        <w:t>Не лить платный трафик без E2E-проверки оплаты и без ЕРИР-маркировки (штрафы + слив бюджета).</w:t>
+        <w:t>Не рекламироваться в Instagram/X/Reddit/Discord/LinkedIn — запрещено (ФЗ-72), штрафы.</w:t>
       </w:r>
     </w:p>
     <w:p>
@@ -3618,7 +2753,7 @@
           <w:color w:val="1A1A1A"/>
           <w:sz w:val="21"/>
         </w:rPr>
-        <w:t>Не масштабировать бюджет до доказанной экономики хотя бы на одном агенте и одном канале.</w:t>
+        <w:t>Не сливать малый бюджет в платное до того, как органика дала платящих.</w:t>
       </w:r>
     </w:p>
     <w:p>
@@ -3635,7 +2770,7 @@
           <w:color w:val="1A1A1A"/>
           <w:sz w:val="21"/>
         </w:rPr>
-        <w:t>Не застревать в НПД, если реклама приводит больше спроса, чем режим позволяет принять.</w:t>
+        <w:t>Не выдавать AI-контент за человеческий там, где это обман — открытость «сделал агент» работает лучше.</w:t>
       </w:r>
     </w:p>
     <w:p>
@@ -3652,7 +2787,7 @@
           <w:color w:val="1A1A1A"/>
           <w:sz w:val="21"/>
         </w:rPr>
-        <w:t>Не распылять усилия на все 8 агентов — 2-3 локомотива, остальное через контент и партнёров.</w:t>
+        <w:t>Не вести 6 соцсетей сразу — 2-3 площадки, где есть ЦА, на остальное нет времени соло.</w:t>
       </w:r>
     </w:p>
     <w:p>
@@ -3669,7 +2804,7 @@
           <w:color w:val="1A1A1A"/>
           <w:sz w:val="21"/>
         </w:rPr>
-        <w:t>Не обещать сторонним продавцам выплаты через платформу в Phase 0 — только free placement + boost.</w:t>
+        <w:t>Не гнаться за охватом ради охвата — мерить лиды, а не просмотры.</w:t>
       </w:r>
     </w:p>
     <w:p>
@@ -3686,7 +2821,7 @@
           <w:color w:val="1A1A1A"/>
           <w:sz w:val="21"/>
         </w:rPr>
-        <w:t>Не доверять старому marketplace-full-plan слепо: Cabinet, Reddit, Twitter build-in-public, «комиссия 15% с продавцов» — устарели или нелегальны.</w:t>
+        <w:t>Не распылять усилия на все 8 агентов — 2-3 локомотива, остальное через кейсы и партнёров.</w:t>
       </w:r>
     </w:p>
     <w:p>
@@ -3705,7 +2840,7 @@
           <w:color w:val="0F766E"/>
           <w:sz w:val="30"/>
         </w:rPr>
-        <w:t>11. Активы — готово и доделать</w:t>
+        <w:t>12. Активы — готово и доделать</w:t>
       </w:r>
     </w:p>
     <w:p>
@@ -3738,7 +2873,7 @@
           <w:color w:val="1A1A1A"/>
           <w:sz w:val="21"/>
         </w:rPr>
-        <w:t>Лендинг hireon.agency (desktop + mobile). Launch-посты X — 3 варианта. sellers-quickstart. Editorial-визуалы (launch-assets-v3).</w:t>
+        <w:t>Лендинг hireon.agency. Launch-посты X (3 варианта). sellers-quickstart. Editorial-визуалы (launch-assets-v3).</w:t>
       </w:r>
     </w:p>
     <w:p>
@@ -3754,7 +2889,7 @@
           <w:color w:val="3A444B"/>
           <w:sz w:val="23"/>
         </w:rPr>
-        <w:t>Доделать (бэклог распространения)</w:t>
+        <w:t>Доделать (бэклог)</w:t>
       </w:r>
     </w:p>
     <w:p>
@@ -3771,7 +2906,7 @@
           <w:color w:val="1A1A1A"/>
           <w:sz w:val="21"/>
         </w:rPr>
-        <w:t>Написать лонгрид «Как я создал маркетплейс AI-агентов» → VC.ru/Habr (drafts/launch-post.md — ещё нет).</w:t>
+        <w:t>Настроить агента-копирайтера на ведение каналов Hireon (dogfooding) — приоритет №1.</w:t>
       </w:r>
     </w:p>
     <w:p>
@@ -3788,7 +2923,7 @@
           <w:color w:val="1A1A1A"/>
           <w:sz w:val="21"/>
         </w:rPr>
-        <w:t>Per-agent SEO-лендинги для 3 локомотивов + оффер с гарантией на каждом.</w:t>
+        <w:t>Лонгрид «Как я создал маркетплейс AI-агентов» → VC.ru/Habr (drafts/launch-post.md — ещё нет).</w:t>
       </w:r>
     </w:p>
     <w:p>
@@ -3805,7 +2940,7 @@
           <w:color w:val="1A1A1A"/>
           <w:sz w:val="21"/>
         </w:rPr>
-        <w:t>Демо-материалы для аутрича: примеры ответов 2ГИС, видео работы бота.</w:t>
+        <w:t>Шаблоны коротких видео + первый лид-магнит «100 ответов на отзывы 2ГИС».</w:t>
       </w:r>
     </w:p>
     <w:p>
@@ -3822,7 +2957,7 @@
           <w:color w:val="1A1A1A"/>
           <w:sz w:val="21"/>
         </w:rPr>
-        <w:t>Скрипт парсинга 2ГИС (карточки с неотвеченными отзывами) + скрипт продажи для подрядчика.</w:t>
+        <w:t>Per-agent SEO-лендинги для 3 локомотивов с оффером-гарантией.</w:t>
       </w:r>
     </w:p>
     <w:p>
@@ -3839,7 +2974,7 @@
           <w:color w:val="1A1A1A"/>
           <w:sz w:val="21"/>
         </w:rPr>
-        <w:t>Регистрация в ЕРИР / подключение eLama для маркировки рекламы.</w:t>
+        <w:t>Скрипт парсинга 2ГИС (карточки с неотвеченными отзывами) для аутрича.</w:t>
       </w:r>
     </w:p>
     <w:p/>
@@ -3852,7 +2987,7 @@
           <w:color w:val="6B7277"/>
           <w:sz w:val="16"/>
         </w:rPr>
-        <w:t>Hireon · Phase 0 · рабочий документ по распространению · v2 (переосмыслено: юр.рамка РФ-2026, платные каналы, развилка НПД/ИП). Правовые детали проверять с актуальными нормами перед запуском.</w:t>
+        <w:t>Hireon · Phase 0 · v3 (малый бюджет: творчество + соцсети + AI-контент; dogfooding как главный рычаг). Платное — точечно после органической валидации. Правовые детали сверять с актуальными нормами.</w:t>
       </w:r>
     </w:p>
     <w:sectPr>

</xml_diff>